<commit_message>
Repaso a la app
</commit_message>
<xml_diff>
--- a/docs/Bases de Datos.docx
+++ b/docs/Bases de Datos.docx
@@ -2,25 +2,557 @@
 <file path=word/document.xml><?xml version="1.0" encoding="utf-8"?>
 <w:document xmlns:wpc="http://schemas.microsoft.com/office/word/2010/wordprocessingCanvas" xmlns:cx="http://schemas.microsoft.com/office/drawing/2014/chartex" xmlns:cx1="http://schemas.microsoft.com/office/drawing/2015/9/8/chartex" xmlns:cx2="http://schemas.microsoft.com/office/drawing/2015/10/21/chartex" xmlns:cx3="http://schemas.microsoft.com/office/drawing/2016/5/9/chartex" xmlns:cx4="http://schemas.microsoft.com/office/drawing/2016/5/10/chartex" xmlns:cx5="http://schemas.microsoft.com/office/drawing/2016/5/11/chartex" xmlns:cx6="http://schemas.microsoft.com/office/drawing/2016/5/12/chartex" xmlns:cx7="http://schemas.microsoft.com/office/drawing/2016/5/13/chartex" xmlns:cx8="http://schemas.microsoft.com/office/drawing/2016/5/14/chartex" xmlns:mc="http://schemas.openxmlformats.org/markup-compatibility/2006" xmlns:aink="http://schemas.microsoft.com/office/drawing/2016/ink" xmlns:am3d="http://schemas.microsoft.com/office/drawing/2017/model3d" xmlns:o="urn:schemas-microsoft-com:office:office" xmlns:oel="http://schemas.microsoft.com/office/2019/extlst" xmlns:r="http://schemas.openxmlformats.org/officeDocument/2006/relationships" xmlns:m="http://schemas.openxmlformats.org/officeDocument/2006/math" xmlns:v="urn:schemas-microsoft-com:vml" xmlns:wp14="http://schemas.microsoft.com/office/word/2010/wordprocessingDrawing" xmlns:wp="http://schemas.openxmlformats.org/drawingml/2006/wordprocessingDrawing" xmlns:w10="urn:schemas-microsoft-com:office:word" xmlns:w="http://schemas.openxmlformats.org/wordprocessingml/2006/main" xmlns:w14="http://schemas.microsoft.com/office/word/2010/wordml" xmlns:w15="http://schemas.microsoft.com/office/word/2012/wordml" xmlns:w16cex="http://schemas.microsoft.com/office/word/2018/wordml/cex" xmlns:w16cid="http://schemas.microsoft.com/office/word/2016/wordml/cid" xmlns:w16="http://schemas.microsoft.com/office/word/2018/wordml" xmlns:w16du="http://schemas.microsoft.com/office/word/2023/wordml/word16du" xmlns:w16sdtdh="http://schemas.microsoft.com/office/word/2020/wordml/sdtdatahash" xmlns:w16sdtfl="http://schemas.microsoft.com/office/word/2024/wordml/sdtformatlock" xmlns:w16se="http://schemas.microsoft.com/office/word/2015/wordml/symex" xmlns:wpg="http://schemas.microsoft.com/office/word/2010/wordprocessingGroup" xmlns:wpi="http://schemas.microsoft.com/office/word/2010/wordprocessingInk" xmlns:wne="http://schemas.microsoft.com/office/word/2006/wordml" xmlns:wps="http://schemas.microsoft.com/office/word/2010/wordprocessingShape" mc:Ignorable="w14 w15 w16se w16cid w16 w16cex w16sdtdh w16sdtfl w16du wp14">
   <w:body>
-    <w:p>
-      <w:pPr>
+    <w:sdt>
+      <w:sdtPr>
+        <w:id w:val="-696235857"/>
+        <w:docPartObj>
+          <w:docPartGallery w:val="Cover Pages"/>
+          <w:docPartUnique/>
+        </w:docPartObj>
+      </w:sdtPr>
+      <w:sdtEndPr>
         <w:rPr>
           <w:b/>
           <w:bCs/>
           <w:sz w:val="32"/>
           <w:szCs w:val="32"/>
         </w:rPr>
-      </w:pPr>
-      <w:r>
-        <w:rPr>
-          <w:b/>
-          <w:bCs/>
-          <w:sz w:val="32"/>
-          <w:szCs w:val="32"/>
-        </w:rPr>
-        <w:t>Bases de Datos</w:t>
-      </w:r>
-    </w:p>
+      </w:sdtEndPr>
+      <w:sdtContent>
+        <w:p/>
+        <w:p>
+          <w:pPr>
+            <w:rPr>
+              <w:b/>
+              <w:bCs/>
+              <w:sz w:val="32"/>
+              <w:szCs w:val="32"/>
+            </w:rPr>
+          </w:pPr>
+          <w:r>
+            <w:rPr>
+              <w:noProof/>
+            </w:rPr>
+            <mc:AlternateContent>
+              <mc:Choice Requires="wps">
+                <w:drawing>
+                  <wp:anchor distT="0" distB="0" distL="182880" distR="182880" simplePos="0" relativeHeight="251660288" behindDoc="0" locked="0" layoutInCell="1" allowOverlap="1" wp14:anchorId="52BDF2C1" wp14:editId="5C16AA55">
+                    <wp:simplePos x="0" y="0"/>
+                    <mc:AlternateContent>
+                      <mc:Choice Requires="wp14">
+                        <wp:positionH relativeFrom="margin">
+                          <wp14:pctPosHOffset>7700</wp14:pctPosHOffset>
+                        </wp:positionH>
+                      </mc:Choice>
+                      <mc:Fallback>
+                        <wp:positionH relativeFrom="page">
+                          <wp:posOffset>1495425</wp:posOffset>
+                        </wp:positionH>
+                      </mc:Fallback>
+                    </mc:AlternateContent>
+                    <mc:AlternateContent>
+                      <mc:Choice Requires="wp14">
+                        <wp:positionV relativeFrom="page">
+                          <wp14:pctPosVOffset>54000</wp14:pctPosVOffset>
+                        </wp:positionV>
+                      </mc:Choice>
+                      <mc:Fallback>
+                        <wp:positionV relativeFrom="page">
+                          <wp:posOffset>5773420</wp:posOffset>
+                        </wp:positionV>
+                      </mc:Fallback>
+                    </mc:AlternateContent>
+                    <wp:extent cx="4686300" cy="6720840"/>
+                    <wp:effectExtent l="0" t="0" r="10160" b="3810"/>
+                    <wp:wrapSquare wrapText="bothSides"/>
+                    <wp:docPr id="131" name="Text Box 131"/>
+                    <wp:cNvGraphicFramePr/>
+                    <a:graphic xmlns:a="http://schemas.openxmlformats.org/drawingml/2006/main">
+                      <a:graphicData uri="http://schemas.microsoft.com/office/word/2010/wordprocessingShape">
+                        <wps:wsp>
+                          <wps:cNvSpPr txBox="1"/>
+                          <wps:spPr>
+                            <a:xfrm>
+                              <a:off x="0" y="0"/>
+                              <a:ext cx="4686300" cy="6720840"/>
+                            </a:xfrm>
+                            <a:prstGeom prst="rect">
+                              <a:avLst/>
+                            </a:prstGeom>
+                            <a:noFill/>
+                            <a:ln w="6350">
+                              <a:noFill/>
+                            </a:ln>
+                            <a:effectLst/>
+                          </wps:spPr>
+                          <wps:style>
+                            <a:lnRef idx="0">
+                              <a:schemeClr val="accent1"/>
+                            </a:lnRef>
+                            <a:fillRef idx="0">
+                              <a:schemeClr val="accent1"/>
+                            </a:fillRef>
+                            <a:effectRef idx="0">
+                              <a:schemeClr val="accent1"/>
+                            </a:effectRef>
+                            <a:fontRef idx="minor">
+                              <a:schemeClr val="dk1"/>
+                            </a:fontRef>
+                          </wps:style>
+                          <wps:txbx>
+                            <w:txbxContent>
+                              <w:p>
+                                <w:pPr>
+                                  <w:pStyle w:val="NoSpacing"/>
+                                  <w:spacing w:before="40" w:after="560" w:line="216" w:lineRule="auto"/>
+                                  <w:rPr>
+                                    <w:color w:val="156082" w:themeColor="accent1"/>
+                                    <w:sz w:val="72"/>
+                                    <w:szCs w:val="72"/>
+                                  </w:rPr>
+                                </w:pPr>
+                                <w:sdt>
+                                  <w:sdtPr>
+                                    <w:rPr>
+                                      <w:color w:val="156082" w:themeColor="accent1"/>
+                                      <w:sz w:val="72"/>
+                                      <w:szCs w:val="72"/>
+                                    </w:rPr>
+                                    <w:alias w:val="Title"/>
+                                    <w:tag w:val=""/>
+                                    <w:id w:val="151731938"/>
+                                    <w:dataBinding w:prefixMappings="xmlns:ns0='http://purl.org/dc/elements/1.1/' xmlns:ns1='http://schemas.openxmlformats.org/package/2006/metadata/core-properties' " w:xpath="/ns1:coreProperties[1]/ns0:title[1]" w:storeItemID="{6C3C8BC8-F283-45AE-878A-BAB7291924A1}"/>
+                                    <w:text/>
+                                  </w:sdtPr>
+                                  <w:sdtContent>
+                                    <w:r>
+                                      <w:rPr>
+                                        <w:color w:val="156082" w:themeColor="accent1"/>
+                                        <w:sz w:val="72"/>
+                                        <w:szCs w:val="72"/>
+                                      </w:rPr>
+                                      <w:t>Bases de Datos</w:t>
+                                    </w:r>
+                                  </w:sdtContent>
+                                </w:sdt>
+                              </w:p>
+                              <w:sdt>
+                                <w:sdtPr>
+                                  <w:rPr>
+                                    <w:caps/>
+                                    <w:color w:val="501549" w:themeColor="accent5" w:themeShade="80"/>
+                                    <w:sz w:val="28"/>
+                                    <w:szCs w:val="28"/>
+                                  </w:rPr>
+                                  <w:alias w:val="Subtitle"/>
+                                  <w:tag w:val=""/>
+                                  <w:id w:val="-2090151685"/>
+                                  <w:dataBinding w:prefixMappings="xmlns:ns0='http://purl.org/dc/elements/1.1/' xmlns:ns1='http://schemas.openxmlformats.org/package/2006/metadata/core-properties' " w:xpath="/ns1:coreProperties[1]/ns0:subject[1]" w:storeItemID="{6C3C8BC8-F283-45AE-878A-BAB7291924A1}"/>
+                                  <w:text/>
+                                </w:sdtPr>
+                                <w:sdtContent>
+                                  <w:p>
+                                    <w:pPr>
+                                      <w:pStyle w:val="NoSpacing"/>
+                                      <w:spacing w:before="40" w:after="40"/>
+                                      <w:rPr>
+                                        <w:caps/>
+                                        <w:color w:val="501549" w:themeColor="accent5" w:themeShade="80"/>
+                                        <w:sz w:val="28"/>
+                                        <w:szCs w:val="28"/>
+                                      </w:rPr>
+                                    </w:pPr>
+                                    <w:r>
+                                      <w:rPr>
+                                        <w:caps/>
+                                        <w:color w:val="501549" w:themeColor="accent5" w:themeShade="80"/>
+                                        <w:sz w:val="28"/>
+                                        <w:szCs w:val="28"/>
+                                      </w:rPr>
+                                      <w:t>Proyecto intermodular</w:t>
+                                    </w:r>
+                                  </w:p>
+                                </w:sdtContent>
+                              </w:sdt>
+                              <w:sdt>
+                                <w:sdtPr>
+                                  <w:rPr>
+                                    <w:caps/>
+                                    <w:color w:val="A02B93" w:themeColor="accent5"/>
+                                    <w:sz w:val="24"/>
+                                    <w:szCs w:val="24"/>
+                                  </w:rPr>
+                                  <w:alias w:val="Author"/>
+                                  <w:tag w:val=""/>
+                                  <w:id w:val="-1536112409"/>
+                                  <w:dataBinding w:prefixMappings="xmlns:ns0='http://purl.org/dc/elements/1.1/' xmlns:ns1='http://schemas.openxmlformats.org/package/2006/metadata/core-properties' " w:xpath="/ns1:coreProperties[1]/ns0:creator[1]" w:storeItemID="{6C3C8BC8-F283-45AE-878A-BAB7291924A1}"/>
+                                  <w:text/>
+                                </w:sdtPr>
+                                <w:sdtContent>
+                                  <w:p>
+                                    <w:pPr>
+                                      <w:pStyle w:val="NoSpacing"/>
+                                      <w:spacing w:before="80" w:after="40"/>
+                                      <w:rPr>
+                                        <w:caps/>
+                                        <w:color w:val="A02B93" w:themeColor="accent5"/>
+                                        <w:sz w:val="24"/>
+                                        <w:szCs w:val="24"/>
+                                      </w:rPr>
+                                    </w:pPr>
+                                    <w:r>
+                                      <w:rPr>
+                                        <w:caps/>
+                                        <w:color w:val="A02B93" w:themeColor="accent5"/>
+                                        <w:sz w:val="24"/>
+                                        <w:szCs w:val="24"/>
+                                      </w:rPr>
+                                      <w:t>Juan Fco MoÑino – Bogdan nemes – ruben selles</w:t>
+                                    </w:r>
+                                  </w:p>
+                                </w:sdtContent>
+                              </w:sdt>
+                            </w:txbxContent>
+                          </wps:txbx>
+                          <wps:bodyPr rot="0" spcFirstLastPara="0" vertOverflow="overflow" horzOverflow="overflow" vert="horz" wrap="square" lIns="0" tIns="0" rIns="0" bIns="0" numCol="1" spcCol="0" rtlCol="0" fromWordArt="0" anchor="t" anchorCtr="0" forceAA="0" compatLnSpc="1">
+                            <a:prstTxWarp prst="textNoShape">
+                              <a:avLst/>
+                            </a:prstTxWarp>
+                            <a:spAutoFit/>
+                          </wps:bodyPr>
+                        </wps:wsp>
+                      </a:graphicData>
+                    </a:graphic>
+                    <wp14:sizeRelH relativeFrom="margin">
+                      <wp14:pctWidth>79000</wp14:pctWidth>
+                    </wp14:sizeRelH>
+                    <wp14:sizeRelV relativeFrom="page">
+                      <wp14:pctHeight>35000</wp14:pctHeight>
+                    </wp14:sizeRelV>
+                  </wp:anchor>
+                </w:drawing>
+              </mc:Choice>
+              <mc:Fallback>
+                <w:pict>
+                  <v:shapetype w14:anchorId="52BDF2C1" id="_x0000_t202" coordsize="21600,21600" o:spt="202" path="m,l,21600r21600,l21600,xe">
+                    <v:stroke joinstyle="miter"/>
+                    <v:path gradientshapeok="t" o:connecttype="rect"/>
+                  </v:shapetype>
+                  <v:shape id="Text Box 131" o:spid="_x0000_s1026" type="#_x0000_t202" style="position:absolute;margin-left:0;margin-top:0;width:369pt;height:529.2pt;z-index:251660288;visibility:visible;mso-wrap-style:square;mso-width-percent:790;mso-height-percent:350;mso-left-percent:77;mso-top-percent:540;mso-wrap-distance-left:14.4pt;mso-wrap-distance-top:0;mso-wrap-distance-right:14.4pt;mso-wrap-distance-bottom:0;mso-position-horizontal-relative:margin;mso-position-vertical-relative:page;mso-width-percent:790;mso-height-percent:350;mso-left-percent:77;mso-top-percent:540;mso-width-relative:margin;mso-height-relative:page;v-text-anchor:top" o:gfxdata="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" filled="f" stroked="f" strokeweight=".5pt">
+                    <v:textbox style="mso-fit-shape-to-text:t" inset="0,0,0,0">
+                      <w:txbxContent>
+                        <w:p>
+                          <w:pPr>
+                            <w:pStyle w:val="NoSpacing"/>
+                            <w:spacing w:before="40" w:after="560" w:line="216" w:lineRule="auto"/>
+                            <w:rPr>
+                              <w:color w:val="156082" w:themeColor="accent1"/>
+                              <w:sz w:val="72"/>
+                              <w:szCs w:val="72"/>
+                            </w:rPr>
+                          </w:pPr>
+                          <w:sdt>
+                            <w:sdtPr>
+                              <w:rPr>
+                                <w:color w:val="156082" w:themeColor="accent1"/>
+                                <w:sz w:val="72"/>
+                                <w:szCs w:val="72"/>
+                              </w:rPr>
+                              <w:alias w:val="Title"/>
+                              <w:tag w:val=""/>
+                              <w:id w:val="151731938"/>
+                              <w:dataBinding w:prefixMappings="xmlns:ns0='http://purl.org/dc/elements/1.1/' xmlns:ns1='http://schemas.openxmlformats.org/package/2006/metadata/core-properties' " w:xpath="/ns1:coreProperties[1]/ns0:title[1]" w:storeItemID="{6C3C8BC8-F283-45AE-878A-BAB7291924A1}"/>
+                              <w:text/>
+                            </w:sdtPr>
+                            <w:sdtContent>
+                              <w:r>
+                                <w:rPr>
+                                  <w:color w:val="156082" w:themeColor="accent1"/>
+                                  <w:sz w:val="72"/>
+                                  <w:szCs w:val="72"/>
+                                </w:rPr>
+                                <w:t>Bases de Datos</w:t>
+                              </w:r>
+                            </w:sdtContent>
+                          </w:sdt>
+                        </w:p>
+                        <w:sdt>
+                          <w:sdtPr>
+                            <w:rPr>
+                              <w:caps/>
+                              <w:color w:val="501549" w:themeColor="accent5" w:themeShade="80"/>
+                              <w:sz w:val="28"/>
+                              <w:szCs w:val="28"/>
+                            </w:rPr>
+                            <w:alias w:val="Subtitle"/>
+                            <w:tag w:val=""/>
+                            <w:id w:val="-2090151685"/>
+                            <w:dataBinding w:prefixMappings="xmlns:ns0='http://purl.org/dc/elements/1.1/' xmlns:ns1='http://schemas.openxmlformats.org/package/2006/metadata/core-properties' " w:xpath="/ns1:coreProperties[1]/ns0:subject[1]" w:storeItemID="{6C3C8BC8-F283-45AE-878A-BAB7291924A1}"/>
+                            <w:text/>
+                          </w:sdtPr>
+                          <w:sdtContent>
+                            <w:p>
+                              <w:pPr>
+                                <w:pStyle w:val="NoSpacing"/>
+                                <w:spacing w:before="40" w:after="40"/>
+                                <w:rPr>
+                                  <w:caps/>
+                                  <w:color w:val="501549" w:themeColor="accent5" w:themeShade="80"/>
+                                  <w:sz w:val="28"/>
+                                  <w:szCs w:val="28"/>
+                                </w:rPr>
+                              </w:pPr>
+                              <w:r>
+                                <w:rPr>
+                                  <w:caps/>
+                                  <w:color w:val="501549" w:themeColor="accent5" w:themeShade="80"/>
+                                  <w:sz w:val="28"/>
+                                  <w:szCs w:val="28"/>
+                                </w:rPr>
+                                <w:t>Proyecto intermodular</w:t>
+                              </w:r>
+                            </w:p>
+                          </w:sdtContent>
+                        </w:sdt>
+                        <w:sdt>
+                          <w:sdtPr>
+                            <w:rPr>
+                              <w:caps/>
+                              <w:color w:val="A02B93" w:themeColor="accent5"/>
+                              <w:sz w:val="24"/>
+                              <w:szCs w:val="24"/>
+                            </w:rPr>
+                            <w:alias w:val="Author"/>
+                            <w:tag w:val=""/>
+                            <w:id w:val="-1536112409"/>
+                            <w:dataBinding w:prefixMappings="xmlns:ns0='http://purl.org/dc/elements/1.1/' xmlns:ns1='http://schemas.openxmlformats.org/package/2006/metadata/core-properties' " w:xpath="/ns1:coreProperties[1]/ns0:creator[1]" w:storeItemID="{6C3C8BC8-F283-45AE-878A-BAB7291924A1}"/>
+                            <w:text/>
+                          </w:sdtPr>
+                          <w:sdtContent>
+                            <w:p>
+                              <w:pPr>
+                                <w:pStyle w:val="NoSpacing"/>
+                                <w:spacing w:before="80" w:after="40"/>
+                                <w:rPr>
+                                  <w:caps/>
+                                  <w:color w:val="A02B93" w:themeColor="accent5"/>
+                                  <w:sz w:val="24"/>
+                                  <w:szCs w:val="24"/>
+                                </w:rPr>
+                              </w:pPr>
+                              <w:r>
+                                <w:rPr>
+                                  <w:caps/>
+                                  <w:color w:val="A02B93" w:themeColor="accent5"/>
+                                  <w:sz w:val="24"/>
+                                  <w:szCs w:val="24"/>
+                                </w:rPr>
+                                <w:t>Juan Fco MoÑino – Bogdan nemes – ruben selles</w:t>
+                              </w:r>
+                            </w:p>
+                          </w:sdtContent>
+                        </w:sdt>
+                      </w:txbxContent>
+                    </v:textbox>
+                    <w10:wrap type="square" anchorx="margin" anchory="page"/>
+                  </v:shape>
+                </w:pict>
+              </mc:Fallback>
+            </mc:AlternateContent>
+          </w:r>
+          <w:r>
+            <w:rPr>
+              <w:noProof/>
+            </w:rPr>
+            <mc:AlternateContent>
+              <mc:Choice Requires="wps">
+                <w:drawing>
+                  <wp:anchor distT="0" distB="0" distL="114300" distR="114300" simplePos="0" relativeHeight="251659264" behindDoc="0" locked="0" layoutInCell="1" allowOverlap="1" wp14:anchorId="6C915F02" wp14:editId="1FF6D1A8">
+                    <wp:simplePos x="0" y="0"/>
+                    <wp:positionH relativeFrom="margin">
+                      <wp:align>right</wp:align>
+                    </wp:positionH>
+                    <mc:AlternateContent>
+                      <mc:Choice Requires="wp14">
+                        <wp:positionV relativeFrom="page">
+                          <wp14:pctPosVOffset>2300</wp14:pctPosVOffset>
+                        </wp:positionV>
+                      </mc:Choice>
+                      <mc:Fallback>
+                        <wp:positionV relativeFrom="page">
+                          <wp:posOffset>245745</wp:posOffset>
+                        </wp:positionV>
+                      </mc:Fallback>
+                    </mc:AlternateContent>
+                    <wp:extent cx="594360" cy="987552"/>
+                    <wp:effectExtent l="0" t="0" r="0" b="5080"/>
+                    <wp:wrapNone/>
+                    <wp:docPr id="132" name="Rectangle 132"/>
+                    <wp:cNvGraphicFramePr>
+                      <a:graphicFrameLocks xmlns:a="http://schemas.openxmlformats.org/drawingml/2006/main" noChangeAspect="1"/>
+                    </wp:cNvGraphicFramePr>
+                    <a:graphic xmlns:a="http://schemas.openxmlformats.org/drawingml/2006/main">
+                      <a:graphicData uri="http://schemas.microsoft.com/office/word/2010/wordprocessingShape">
+                        <wps:wsp>
+                          <wps:cNvSpPr>
+                            <a:spLocks noChangeAspect="1"/>
+                          </wps:cNvSpPr>
+                          <wps:spPr>
+                            <a:xfrm>
+                              <a:off x="0" y="0"/>
+                              <a:ext cx="594360" cy="987552"/>
+                            </a:xfrm>
+                            <a:prstGeom prst="rect">
+                              <a:avLst/>
+                            </a:prstGeom>
+                            <a:ln>
+                              <a:noFill/>
+                            </a:ln>
+                          </wps:spPr>
+                          <wps:style>
+                            <a:lnRef idx="2">
+                              <a:schemeClr val="accent1">
+                                <a:shade val="50000"/>
+                              </a:schemeClr>
+                            </a:lnRef>
+                            <a:fillRef idx="1">
+                              <a:schemeClr val="accent1"/>
+                            </a:fillRef>
+                            <a:effectRef idx="0">
+                              <a:schemeClr val="accent1"/>
+                            </a:effectRef>
+                            <a:fontRef idx="minor">
+                              <a:schemeClr val="lt1"/>
+                            </a:fontRef>
+                          </wps:style>
+                          <wps:txbx>
+                            <w:txbxContent>
+                              <w:sdt>
+                                <w:sdtPr>
+                                  <w:rPr>
+                                    <w:color w:val="FFFFFF" w:themeColor="background1"/>
+                                    <w:sz w:val="24"/>
+                                    <w:szCs w:val="24"/>
+                                  </w:rPr>
+                                  <w:alias w:val="Year"/>
+                                  <w:tag w:val=""/>
+                                  <w:id w:val="-785116381"/>
+                                  <w:dataBinding w:prefixMappings="xmlns:ns0='http://schemas.microsoft.com/office/2006/coverPageProps' " w:xpath="/ns0:CoverPageProperties[1]/ns0:PublishDate[1]" w:storeItemID="{55AF091B-3C7A-41E3-B477-F2FDAA23CFDA}"/>
+                                  <w:date>
+                                    <w:dateFormat w:val="yyyy"/>
+                                    <w:lid w:val="en-US"/>
+                                    <w:storeMappedDataAs w:val="dateTime"/>
+                                    <w:calendar w:val="gregorian"/>
+                                  </w:date>
+                                </w:sdtPr>
+                                <w:sdtContent>
+                                  <w:p>
+                                    <w:pPr>
+                                      <w:pStyle w:val="NoSpacing"/>
+                                      <w:jc w:val="right"/>
+                                      <w:rPr>
+                                        <w:color w:val="FFFFFF" w:themeColor="background1"/>
+                                        <w:sz w:val="24"/>
+                                        <w:szCs w:val="24"/>
+                                      </w:rPr>
+                                    </w:pPr>
+                                    <w:r>
+                                      <w:rPr>
+                                        <w:color w:val="FFFFFF" w:themeColor="background1"/>
+                                        <w:sz w:val="24"/>
+                                        <w:szCs w:val="24"/>
+                                      </w:rPr>
+                                      <w:t>1DAM</w:t>
+                                    </w:r>
+                                  </w:p>
+                                </w:sdtContent>
+                              </w:sdt>
+                            </w:txbxContent>
+                          </wps:txbx>
+                          <wps:bodyPr rot="0" spcFirstLastPara="0" vertOverflow="overflow" horzOverflow="overflow" vert="horz" wrap="square" lIns="45720" tIns="45720" rIns="45720" bIns="45720" numCol="1" spcCol="0" rtlCol="0" fromWordArt="0" anchor="b" anchorCtr="0" forceAA="0" compatLnSpc="1">
+                            <a:prstTxWarp prst="textNoShape">
+                              <a:avLst/>
+                            </a:prstTxWarp>
+                            <a:noAutofit/>
+                          </wps:bodyPr>
+                        </wps:wsp>
+                      </a:graphicData>
+                    </a:graphic>
+                    <wp14:sizeRelH relativeFrom="page">
+                      <wp14:pctWidth>7600</wp14:pctWidth>
+                    </wp14:sizeRelH>
+                    <wp14:sizeRelV relativeFrom="page">
+                      <wp14:pctHeight>9800</wp14:pctHeight>
+                    </wp14:sizeRelV>
+                  </wp:anchor>
+                </w:drawing>
+              </mc:Choice>
+              <mc:Fallback>
+                <w:pict>
+                  <v:rect w14:anchorId="6C915F02" id="Rectangle 132" o:spid="_x0000_s1027" style="position:absolute;margin-left:-4.4pt;margin-top:0;width:46.8pt;height:77.75pt;z-index:251659264;visibility:visible;mso-wrap-style:square;mso-width-percent:76;mso-height-percent:98;mso-top-percent:23;mso-wrap-distance-left:9pt;mso-wrap-distance-top:0;mso-wrap-distance-right:9pt;mso-wrap-distance-bottom:0;mso-position-horizontal:right;mso-position-horizontal-relative:margin;mso-position-vertical-relative:page;mso-width-percent:76;mso-height-percent:98;mso-top-percent:23;mso-width-relative:page;mso-height-relative:page;v-text-anchor:bottom" o:gfxdata="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" fillcolor="#156082 [3204]" stroked="f" strokeweight="1.5pt">
+                    <o:lock v:ext="edit" aspectratio="t"/>
+                    <v:textbox inset="3.6pt,,3.6pt">
+                      <w:txbxContent>
+                        <w:sdt>
+                          <w:sdtPr>
+                            <w:rPr>
+                              <w:color w:val="FFFFFF" w:themeColor="background1"/>
+                              <w:sz w:val="24"/>
+                              <w:szCs w:val="24"/>
+                            </w:rPr>
+                            <w:alias w:val="Year"/>
+                            <w:tag w:val=""/>
+                            <w:id w:val="-785116381"/>
+                            <w:dataBinding w:prefixMappings="xmlns:ns0='http://schemas.microsoft.com/office/2006/coverPageProps' " w:xpath="/ns0:CoverPageProperties[1]/ns0:PublishDate[1]" w:storeItemID="{55AF091B-3C7A-41E3-B477-F2FDAA23CFDA}"/>
+                            <w:date>
+                              <w:dateFormat w:val="yyyy"/>
+                              <w:lid w:val="en-US"/>
+                              <w:storeMappedDataAs w:val="dateTime"/>
+                              <w:calendar w:val="gregorian"/>
+                            </w:date>
+                          </w:sdtPr>
+                          <w:sdtContent>
+                            <w:p>
+                              <w:pPr>
+                                <w:pStyle w:val="NoSpacing"/>
+                                <w:jc w:val="right"/>
+                                <w:rPr>
+                                  <w:color w:val="FFFFFF" w:themeColor="background1"/>
+                                  <w:sz w:val="24"/>
+                                  <w:szCs w:val="24"/>
+                                </w:rPr>
+                              </w:pPr>
+                              <w:r>
+                                <w:rPr>
+                                  <w:color w:val="FFFFFF" w:themeColor="background1"/>
+                                  <w:sz w:val="24"/>
+                                  <w:szCs w:val="24"/>
+                                </w:rPr>
+                                <w:t>1DAM</w:t>
+                              </w:r>
+                            </w:p>
+                          </w:sdtContent>
+                        </w:sdt>
+                      </w:txbxContent>
+                    </v:textbox>
+                    <w10:wrap anchorx="margin" anchory="page"/>
+                  </v:rect>
+                </w:pict>
+              </mc:Fallback>
+            </mc:AlternateContent>
+          </w:r>
+          <w:r>
+            <w:rPr>
+              <w:b/>
+              <w:bCs/>
+              <w:sz w:val="32"/>
+              <w:szCs w:val="32"/>
+            </w:rPr>
+            <w:br w:type="page"/>
+          </w:r>
+        </w:p>
+      </w:sdtContent>
+    </w:sdt>
     <w:p>
       <w:pPr>
         <w:rPr>
@@ -37,6 +569,7 @@
           <w:sz w:val="28"/>
           <w:szCs w:val="28"/>
         </w:rPr>
+        <w:lastRenderedPageBreak/>
         <w:t>Introducción</w:t>
       </w:r>
     </w:p>
@@ -49,6 +582,26 @@
       <w:r>
         <w:t>El sistema permite registrar incidencias, asignarlas a técnicos, controlar estados, almacenar históricos y generar auditorías, garantizando la integridad y trazabilidad de la información.</w:t>
       </w:r>
+    </w:p>
+    <w:p>
+      <w:pPr>
+        <w:rPr>
+          <w:b/>
+          <w:bCs/>
+          <w:sz w:val="28"/>
+          <w:szCs w:val="28"/>
+        </w:rPr>
+      </w:pPr>
+    </w:p>
+    <w:p>
+      <w:pPr>
+        <w:rPr>
+          <w:b/>
+          <w:bCs/>
+          <w:sz w:val="28"/>
+          <w:szCs w:val="28"/>
+        </w:rPr>
+      </w:pPr>
     </w:p>
     <w:p>
       <w:pPr>
@@ -113,6 +666,8 @@
         <w:rPr>
           <w:b/>
           <w:bCs/>
+          <w:sz w:val="28"/>
+          <w:szCs w:val="28"/>
         </w:rPr>
       </w:pPr>
       <w:r>
@@ -122,10 +677,10 @@
           <w:noProof/>
         </w:rPr>
         <w:drawing>
-          <wp:inline distT="0" distB="0" distL="0" distR="0" wp14:anchorId="06AB517B" wp14:editId="47934598">
-            <wp:extent cx="5400040" cy="7285990"/>
+          <wp:inline distT="0" distB="0" distL="0" distR="0" wp14:anchorId="5A32B4E4" wp14:editId="33869E97">
+            <wp:extent cx="6292850" cy="6292850"/>
             <wp:effectExtent l="0" t="0" r="0" b="0"/>
-            <wp:docPr id="1451447957" name="Picture 2"/>
+            <wp:docPr id="1443237789" name="Picture 3"/>
             <wp:cNvGraphicFramePr>
               <a:graphicFrameLocks xmlns:a="http://schemas.openxmlformats.org/drawingml/2006/main" noChangeAspect="1"/>
             </wp:cNvGraphicFramePr>
@@ -133,29 +688,36 @@
               <a:graphicData uri="http://schemas.openxmlformats.org/drawingml/2006/picture">
                 <pic:pic xmlns:pic="http://schemas.openxmlformats.org/drawingml/2006/picture">
                   <pic:nvPicPr>
-                    <pic:cNvPr id="1451447957" name="Picture 1451447957"/>
-                    <pic:cNvPicPr/>
+                    <pic:cNvPr id="0" name="Picture 3"/>
+                    <pic:cNvPicPr>
+                      <a:picLocks noChangeAspect="1" noChangeArrowheads="1"/>
+                    </pic:cNvPicPr>
                   </pic:nvPicPr>
                   <pic:blipFill>
-                    <a:blip r:embed="rId8" cstate="print">
+                    <a:blip r:embed="rId12" cstate="print">
                       <a:extLst>
                         <a:ext uri="{28A0092B-C50C-407E-A947-70E740481C1C}">
                           <a14:useLocalDpi xmlns:a14="http://schemas.microsoft.com/office/drawing/2010/main" val="0"/>
                         </a:ext>
                       </a:extLst>
                     </a:blip>
+                    <a:srcRect/>
                     <a:stretch>
                       <a:fillRect/>
                     </a:stretch>
                   </pic:blipFill>
-                  <pic:spPr>
+                  <pic:spPr bwMode="auto">
                     <a:xfrm>
                       <a:off x="0" y="0"/>
-                      <a:ext cx="5400040" cy="7285990"/>
+                      <a:ext cx="6292850" cy="6292850"/>
                     </a:xfrm>
                     <a:prstGeom prst="rect">
                       <a:avLst/>
                     </a:prstGeom>
+                    <a:noFill/>
+                    <a:ln>
+                      <a:noFill/>
+                    </a:ln>
                   </pic:spPr>
                 </pic:pic>
               </a:graphicData>
@@ -163,16 +725,6 @@
           </wp:inline>
         </w:drawing>
       </w:r>
-    </w:p>
-    <w:p>
-      <w:pPr>
-        <w:rPr>
-          <w:b/>
-          <w:bCs/>
-          <w:sz w:val="28"/>
-          <w:szCs w:val="28"/>
-        </w:rPr>
-      </w:pPr>
       <w:r>
         <w:rPr>
           <w:b/>
@@ -241,7 +793,7 @@
         <w:tblLook w:val="04A0" w:firstRow="1" w:lastRow="0" w:firstColumn="1" w:lastColumn="0" w:noHBand="0" w:noVBand="1"/>
       </w:tblPr>
       <w:tblGrid>
-        <w:gridCol w:w="1297"/>
+        <w:gridCol w:w="1354"/>
         <w:gridCol w:w="685"/>
         <w:gridCol w:w="4904"/>
       </w:tblGrid>
@@ -454,6 +1006,76 @@
           <w:p>
             <w:r>
               <w:t>Explicación de los permisos o funciones del rol</w:t>
+            </w:r>
+          </w:p>
+        </w:tc>
+      </w:tr>
+      <w:tr>
+        <w:trPr>
+          <w:tblCellSpacing w:w="15" w:type="dxa"/>
+        </w:trPr>
+        <w:tc>
+          <w:tcPr>
+            <w:tcW w:w="0" w:type="auto"/>
+            <w:vAlign w:val="center"/>
+          </w:tcPr>
+          <w:p>
+            <w:r>
+              <w:t>activo</w:t>
+            </w:r>
+          </w:p>
+        </w:tc>
+        <w:tc>
+          <w:tcPr>
+            <w:tcW w:w="0" w:type="auto"/>
+            <w:vAlign w:val="center"/>
+          </w:tcPr>
+          <w:p/>
+        </w:tc>
+        <w:tc>
+          <w:tcPr>
+            <w:tcW w:w="0" w:type="auto"/>
+            <w:vAlign w:val="center"/>
+          </w:tcPr>
+          <w:p>
+            <w:r>
+              <w:t>Indica si la cuenta está habilitada</w:t>
+            </w:r>
+          </w:p>
+        </w:tc>
+      </w:tr>
+      <w:tr>
+        <w:trPr>
+          <w:tblCellSpacing w:w="15" w:type="dxa"/>
+        </w:trPr>
+        <w:tc>
+          <w:tcPr>
+            <w:tcW w:w="0" w:type="auto"/>
+            <w:vAlign w:val="center"/>
+          </w:tcPr>
+          <w:p>
+            <w:proofErr w:type="spellStart"/>
+            <w:r>
+              <w:t>ultimo_login</w:t>
+            </w:r>
+            <w:proofErr w:type="spellEnd"/>
+          </w:p>
+        </w:tc>
+        <w:tc>
+          <w:tcPr>
+            <w:tcW w:w="0" w:type="auto"/>
+            <w:vAlign w:val="center"/>
+          </w:tcPr>
+          <w:p/>
+        </w:tc>
+        <w:tc>
+          <w:tcPr>
+            <w:tcW w:w="0" w:type="auto"/>
+            <w:vAlign w:val="center"/>
+          </w:tcPr>
+          <w:p>
+            <w:r>
+              <w:t>Fecha y hora del último acceso</w:t>
             </w:r>
           </w:p>
         </w:tc>
@@ -770,6 +1392,87 @@
             <w:hideMark/>
           </w:tcPr>
           <w:p>
+            <w:proofErr w:type="spellStart"/>
+            <w:r>
+              <w:t>primer_acceso</w:t>
+            </w:r>
+            <w:proofErr w:type="spellEnd"/>
+          </w:p>
+        </w:tc>
+        <w:tc>
+          <w:tcPr>
+            <w:tcW w:w="655" w:type="dxa"/>
+            <w:vAlign w:val="center"/>
+            <w:hideMark/>
+          </w:tcPr>
+          <w:p/>
+        </w:tc>
+        <w:tc>
+          <w:tcPr>
+            <w:tcW w:w="3829" w:type="dxa"/>
+            <w:vAlign w:val="center"/>
+            <w:hideMark/>
+          </w:tcPr>
+          <w:p>
+            <w:r>
+              <w:t>Permite forzar cambio de contraseña</w:t>
+            </w:r>
+          </w:p>
+        </w:tc>
+      </w:tr>
+      <w:tr>
+        <w:trPr>
+          <w:tblCellSpacing w:w="15" w:type="dxa"/>
+        </w:trPr>
+        <w:tc>
+          <w:tcPr>
+            <w:tcW w:w="0" w:type="auto"/>
+            <w:vAlign w:val="center"/>
+            <w:hideMark/>
+          </w:tcPr>
+          <w:p>
+            <w:proofErr w:type="spellStart"/>
+            <w:r>
+              <w:t>id_rol</w:t>
+            </w:r>
+            <w:proofErr w:type="spellEnd"/>
+          </w:p>
+        </w:tc>
+        <w:tc>
+          <w:tcPr>
+            <w:tcW w:w="655" w:type="dxa"/>
+            <w:vAlign w:val="center"/>
+            <w:hideMark/>
+          </w:tcPr>
+          <w:p>
+            <w:r>
+              <w:t>FK</w:t>
+            </w:r>
+          </w:p>
+        </w:tc>
+        <w:tc>
+          <w:tcPr>
+            <w:tcW w:w="3829" w:type="dxa"/>
+            <w:vAlign w:val="center"/>
+            <w:hideMark/>
+          </w:tcPr>
+          <w:p>
+            <w:r>
+              <w:t>Rol asignado al usuario</w:t>
+            </w:r>
+          </w:p>
+        </w:tc>
+      </w:tr>
+      <w:tr>
+        <w:trPr>
+          <w:tblCellSpacing w:w="15" w:type="dxa"/>
+        </w:trPr>
+        <w:tc>
+          <w:tcPr>
+            <w:tcW w:w="0" w:type="auto"/>
+            <w:vAlign w:val="center"/>
+          </w:tcPr>
+          <w:p>
             <w:r>
               <w:t>activo</w:t>
             </w:r>
@@ -779,7 +1482,6 @@
           <w:tcPr>
             <w:tcW w:w="655" w:type="dxa"/>
             <w:vAlign w:val="center"/>
-            <w:hideMark/>
           </w:tcPr>
           <w:p/>
         </w:tc>
@@ -787,132 +1489,10 @@
           <w:tcPr>
             <w:tcW w:w="3829" w:type="dxa"/>
             <w:vAlign w:val="center"/>
-            <w:hideMark/>
-          </w:tcPr>
-          <w:p>
-            <w:r>
-              <w:t>Indica si la cuenta está habilitada</w:t>
-            </w:r>
-          </w:p>
-        </w:tc>
-      </w:tr>
-      <w:tr>
-        <w:trPr>
-          <w:tblCellSpacing w:w="15" w:type="dxa"/>
-        </w:trPr>
-        <w:tc>
-          <w:tcPr>
-            <w:tcW w:w="0" w:type="auto"/>
-            <w:vAlign w:val="center"/>
-            <w:hideMark/>
-          </w:tcPr>
-          <w:p>
-            <w:proofErr w:type="spellStart"/>
-            <w:r>
-              <w:t>primer_acceso</w:t>
-            </w:r>
-            <w:proofErr w:type="spellEnd"/>
-          </w:p>
-        </w:tc>
-        <w:tc>
-          <w:tcPr>
-            <w:tcW w:w="655" w:type="dxa"/>
-            <w:vAlign w:val="center"/>
-            <w:hideMark/>
-          </w:tcPr>
-          <w:p/>
-        </w:tc>
-        <w:tc>
-          <w:tcPr>
-            <w:tcW w:w="3829" w:type="dxa"/>
-            <w:vAlign w:val="center"/>
-            <w:hideMark/>
-          </w:tcPr>
-          <w:p>
-            <w:r>
-              <w:t>Permite forzar cambio de contraseña</w:t>
-            </w:r>
-          </w:p>
-        </w:tc>
-      </w:tr>
-      <w:tr>
-        <w:trPr>
-          <w:tblCellSpacing w:w="15" w:type="dxa"/>
-        </w:trPr>
-        <w:tc>
-          <w:tcPr>
-            <w:tcW w:w="0" w:type="auto"/>
-            <w:vAlign w:val="center"/>
-            <w:hideMark/>
-          </w:tcPr>
-          <w:p>
-            <w:proofErr w:type="spellStart"/>
-            <w:r>
-              <w:t>ultimo_login</w:t>
-            </w:r>
-            <w:proofErr w:type="spellEnd"/>
-          </w:p>
-        </w:tc>
-        <w:tc>
-          <w:tcPr>
-            <w:tcW w:w="655" w:type="dxa"/>
-            <w:vAlign w:val="center"/>
-            <w:hideMark/>
-          </w:tcPr>
-          <w:p/>
-        </w:tc>
-        <w:tc>
-          <w:tcPr>
-            <w:tcW w:w="3829" w:type="dxa"/>
-            <w:vAlign w:val="center"/>
-            <w:hideMark/>
-          </w:tcPr>
-          <w:p>
-            <w:r>
-              <w:t>Fecha y hora del último acceso</w:t>
-            </w:r>
-          </w:p>
-        </w:tc>
-      </w:tr>
-      <w:tr>
-        <w:trPr>
-          <w:tblCellSpacing w:w="15" w:type="dxa"/>
-        </w:trPr>
-        <w:tc>
-          <w:tcPr>
-            <w:tcW w:w="0" w:type="auto"/>
-            <w:vAlign w:val="center"/>
-            <w:hideMark/>
-          </w:tcPr>
-          <w:p>
-            <w:proofErr w:type="spellStart"/>
-            <w:r>
-              <w:t>id_rol</w:t>
-            </w:r>
-            <w:proofErr w:type="spellEnd"/>
-          </w:p>
-        </w:tc>
-        <w:tc>
-          <w:tcPr>
-            <w:tcW w:w="655" w:type="dxa"/>
-            <w:vAlign w:val="center"/>
-            <w:hideMark/>
-          </w:tcPr>
-          <w:p>
-            <w:r>
-              <w:t>FK</w:t>
-            </w:r>
-          </w:p>
-        </w:tc>
-        <w:tc>
-          <w:tcPr>
-            <w:tcW w:w="3829" w:type="dxa"/>
-            <w:vAlign w:val="center"/>
-            <w:hideMark/>
-          </w:tcPr>
-          <w:p>
-            <w:r>
-              <w:t>Rol asignado al usuario</w:t>
+          </w:tcPr>
+          <w:p>
+            <w:r>
+              <w:t>Indica si el puesto está activo</w:t>
             </w:r>
           </w:p>
         </w:tc>
@@ -1204,82 +1784,6 @@
           <w:p>
             <w:proofErr w:type="spellStart"/>
             <w:r>
-              <w:t>descripcion</w:t>
-            </w:r>
-            <w:proofErr w:type="spellEnd"/>
-          </w:p>
-        </w:tc>
-        <w:tc>
-          <w:tcPr>
-            <w:tcW w:w="0" w:type="auto"/>
-            <w:vAlign w:val="center"/>
-            <w:hideMark/>
-          </w:tcPr>
-          <w:p/>
-        </w:tc>
-        <w:tc>
-          <w:tcPr>
-            <w:tcW w:w="0" w:type="auto"/>
-            <w:vAlign w:val="center"/>
-            <w:hideMark/>
-          </w:tcPr>
-          <w:p>
-            <w:r>
-              <w:t>Descripción física o funcional</w:t>
-            </w:r>
-          </w:p>
-        </w:tc>
-      </w:tr>
-      <w:tr>
-        <w:trPr>
-          <w:tblCellSpacing w:w="15" w:type="dxa"/>
-        </w:trPr>
-        <w:tc>
-          <w:tcPr>
-            <w:tcW w:w="0" w:type="auto"/>
-            <w:vAlign w:val="center"/>
-            <w:hideMark/>
-          </w:tcPr>
-          <w:p>
-            <w:r>
-              <w:t>activo</w:t>
-            </w:r>
-          </w:p>
-        </w:tc>
-        <w:tc>
-          <w:tcPr>
-            <w:tcW w:w="0" w:type="auto"/>
-            <w:vAlign w:val="center"/>
-            <w:hideMark/>
-          </w:tcPr>
-          <w:p/>
-        </w:tc>
-        <w:tc>
-          <w:tcPr>
-            <w:tcW w:w="0" w:type="auto"/>
-            <w:vAlign w:val="center"/>
-            <w:hideMark/>
-          </w:tcPr>
-          <w:p>
-            <w:r>
-              <w:t>Indica si el puesto sigue operativo</w:t>
-            </w:r>
-          </w:p>
-        </w:tc>
-      </w:tr>
-      <w:tr>
-        <w:trPr>
-          <w:tblCellSpacing w:w="15" w:type="dxa"/>
-        </w:trPr>
-        <w:tc>
-          <w:tcPr>
-            <w:tcW w:w="0" w:type="auto"/>
-            <w:vAlign w:val="center"/>
-            <w:hideMark/>
-          </w:tcPr>
-          <w:p>
-            <w:proofErr w:type="spellStart"/>
-            <w:r>
               <w:t>id_usuario</w:t>
             </w:r>
             <w:proofErr w:type="spellEnd"/>
@@ -1876,6 +2380,22 @@
           <w:b/>
           <w:bCs/>
         </w:rPr>
+        <w:br w:type="page"/>
+      </w:r>
+    </w:p>
+    <w:p>
+      <w:pPr>
+        <w:rPr>
+          <w:b/>
+          <w:bCs/>
+        </w:rPr>
+      </w:pPr>
+      <w:r>
+        <w:rPr>
+          <w:b/>
+          <w:bCs/>
+        </w:rPr>
+        <w:lastRenderedPageBreak/>
         <w:t>ASIGNACION</w:t>
       </w:r>
     </w:p>
@@ -1897,7 +2417,7 @@
         <w:tblLook w:val="04A0" w:firstRow="1" w:lastRow="0" w:firstColumn="1" w:lastColumn="0" w:noHBand="0" w:noVBand="1"/>
       </w:tblPr>
       <w:tblGrid>
-        <w:gridCol w:w="1956"/>
+        <w:gridCol w:w="1893"/>
         <w:gridCol w:w="685"/>
         <w:gridCol w:w="3749"/>
       </w:tblGrid>
@@ -1924,7 +2444,6 @@
                 <w:b/>
                 <w:bCs/>
               </w:rPr>
-              <w:lastRenderedPageBreak/>
               <w:t>Campo</w:t>
             </w:r>
           </w:p>
@@ -2111,45 +2630,6 @@
           <w:p>
             <w:r>
               <w:t>Fecha de finalización</w:t>
-            </w:r>
-          </w:p>
-        </w:tc>
-      </w:tr>
-      <w:tr>
-        <w:trPr>
-          <w:tblCellSpacing w:w="15" w:type="dxa"/>
-        </w:trPr>
-        <w:tc>
-          <w:tcPr>
-            <w:tcW w:w="0" w:type="auto"/>
-            <w:vAlign w:val="center"/>
-            <w:hideMark/>
-          </w:tcPr>
-          <w:p>
-            <w:proofErr w:type="spellStart"/>
-            <w:r>
-              <w:t>tipo_participacion</w:t>
-            </w:r>
-            <w:proofErr w:type="spellEnd"/>
-          </w:p>
-        </w:tc>
-        <w:tc>
-          <w:tcPr>
-            <w:tcW w:w="0" w:type="auto"/>
-            <w:vAlign w:val="center"/>
-            <w:hideMark/>
-          </w:tcPr>
-          <w:p/>
-        </w:tc>
-        <w:tc>
-          <w:tcPr>
-            <w:tcW w:w="0" w:type="auto"/>
-            <w:vAlign w:val="center"/>
-            <w:hideMark/>
-          </w:tcPr>
-          <w:p>
-            <w:r>
-              <w:t>Tipo de intervención realizada</w:t>
             </w:r>
           </w:p>
         </w:tc>
@@ -2523,7 +3003,7 @@
           </w:tcPr>
           <w:p>
             <w:r>
-              <w:t>FK</w:t>
+              <w:t>UK</w:t>
             </w:r>
           </w:p>
         </w:tc>
@@ -3080,6 +3560,349 @@
           <w:b/>
           <w:bCs/>
         </w:rPr>
+        <w:t>NOTA_INTERNA</w:t>
+      </w:r>
+    </w:p>
+    <w:p>
+      <w:r>
+        <w:t>Almacena notas internas añadidas por los técnicos durante la gestión de la incidencia.</w:t>
+      </w:r>
+    </w:p>
+    <w:tbl>
+      <w:tblPr>
+        <w:tblW w:w="0" w:type="auto"/>
+        <w:tblCellSpacing w:w="15" w:type="dxa"/>
+        <w:tblCellMar>
+          <w:top w:w="15" w:type="dxa"/>
+          <w:left w:w="15" w:type="dxa"/>
+          <w:bottom w:w="15" w:type="dxa"/>
+          <w:right w:w="15" w:type="dxa"/>
+        </w:tblCellMar>
+        <w:tblLook w:val="04A0" w:firstRow="1" w:lastRow="0" w:firstColumn="1" w:lastColumn="0" w:noHBand="0" w:noVBand="1"/>
+      </w:tblPr>
+      <w:tblGrid>
+        <w:gridCol w:w="1672"/>
+        <w:gridCol w:w="685"/>
+        <w:gridCol w:w="3093"/>
+      </w:tblGrid>
+      <w:tr>
+        <w:trPr>
+          <w:tblHeader/>
+          <w:tblCellSpacing w:w="15" w:type="dxa"/>
+        </w:trPr>
+        <w:tc>
+          <w:tcPr>
+            <w:tcW w:w="0" w:type="auto"/>
+            <w:vAlign w:val="center"/>
+            <w:hideMark/>
+          </w:tcPr>
+          <w:p>
+            <w:pPr>
+              <w:rPr>
+                <w:b/>
+                <w:bCs/>
+              </w:rPr>
+            </w:pPr>
+            <w:r>
+              <w:rPr>
+                <w:b/>
+                <w:bCs/>
+              </w:rPr>
+              <w:t>Campo</w:t>
+            </w:r>
+          </w:p>
+        </w:tc>
+        <w:tc>
+          <w:tcPr>
+            <w:tcW w:w="0" w:type="auto"/>
+            <w:vAlign w:val="center"/>
+            <w:hideMark/>
+          </w:tcPr>
+          <w:p>
+            <w:pPr>
+              <w:rPr>
+                <w:b/>
+                <w:bCs/>
+              </w:rPr>
+            </w:pPr>
+            <w:r>
+              <w:rPr>
+                <w:b/>
+                <w:bCs/>
+              </w:rPr>
+              <w:t>Clave</w:t>
+            </w:r>
+          </w:p>
+        </w:tc>
+        <w:tc>
+          <w:tcPr>
+            <w:tcW w:w="0" w:type="auto"/>
+            <w:vAlign w:val="center"/>
+            <w:hideMark/>
+          </w:tcPr>
+          <w:p>
+            <w:pPr>
+              <w:rPr>
+                <w:b/>
+                <w:bCs/>
+              </w:rPr>
+            </w:pPr>
+            <w:r>
+              <w:rPr>
+                <w:b/>
+                <w:bCs/>
+              </w:rPr>
+              <w:t>Descripción</w:t>
+            </w:r>
+          </w:p>
+        </w:tc>
+      </w:tr>
+      <w:tr>
+        <w:trPr>
+          <w:tblCellSpacing w:w="15" w:type="dxa"/>
+        </w:trPr>
+        <w:tc>
+          <w:tcPr>
+            <w:tcW w:w="0" w:type="auto"/>
+            <w:vAlign w:val="center"/>
+            <w:hideMark/>
+          </w:tcPr>
+          <w:p>
+            <w:pPr>
+              <w:rPr>
+                <w:b/>
+                <w:bCs/>
+              </w:rPr>
+            </w:pPr>
+            <w:proofErr w:type="spellStart"/>
+            <w:r>
+              <w:rPr>
+                <w:b/>
+                <w:bCs/>
+              </w:rPr>
+              <w:t>id_nota</w:t>
+            </w:r>
+            <w:proofErr w:type="spellEnd"/>
+          </w:p>
+        </w:tc>
+        <w:tc>
+          <w:tcPr>
+            <w:tcW w:w="0" w:type="auto"/>
+            <w:vAlign w:val="center"/>
+            <w:hideMark/>
+          </w:tcPr>
+          <w:p>
+            <w:pPr>
+              <w:rPr>
+                <w:b/>
+                <w:bCs/>
+              </w:rPr>
+            </w:pPr>
+            <w:r>
+              <w:rPr>
+                <w:b/>
+                <w:bCs/>
+              </w:rPr>
+              <w:t>PK</w:t>
+            </w:r>
+          </w:p>
+        </w:tc>
+        <w:tc>
+          <w:tcPr>
+            <w:tcW w:w="0" w:type="auto"/>
+            <w:vAlign w:val="center"/>
+            <w:hideMark/>
+          </w:tcPr>
+          <w:p>
+            <w:r>
+              <w:t>Identificador único de la nota</w:t>
+            </w:r>
+          </w:p>
+        </w:tc>
+      </w:tr>
+      <w:tr>
+        <w:trPr>
+          <w:tblCellSpacing w:w="15" w:type="dxa"/>
+        </w:trPr>
+        <w:tc>
+          <w:tcPr>
+            <w:tcW w:w="0" w:type="auto"/>
+            <w:vAlign w:val="center"/>
+            <w:hideMark/>
+          </w:tcPr>
+          <w:p>
+            <w:r>
+              <w:t>nota</w:t>
+            </w:r>
+          </w:p>
+        </w:tc>
+        <w:tc>
+          <w:tcPr>
+            <w:tcW w:w="0" w:type="auto"/>
+            <w:vAlign w:val="center"/>
+            <w:hideMark/>
+          </w:tcPr>
+          <w:p/>
+        </w:tc>
+        <w:tc>
+          <w:tcPr>
+            <w:tcW w:w="0" w:type="auto"/>
+            <w:vAlign w:val="center"/>
+            <w:hideMark/>
+          </w:tcPr>
+          <w:p>
+            <w:r>
+              <w:t>Contenido de la nota interna</w:t>
+            </w:r>
+          </w:p>
+        </w:tc>
+      </w:tr>
+      <w:tr>
+        <w:trPr>
+          <w:tblCellSpacing w:w="15" w:type="dxa"/>
+        </w:trPr>
+        <w:tc>
+          <w:tcPr>
+            <w:tcW w:w="0" w:type="auto"/>
+            <w:vAlign w:val="center"/>
+            <w:hideMark/>
+          </w:tcPr>
+          <w:p>
+            <w:proofErr w:type="spellStart"/>
+            <w:r>
+              <w:t>fecha_creacion</w:t>
+            </w:r>
+            <w:proofErr w:type="spellEnd"/>
+          </w:p>
+        </w:tc>
+        <w:tc>
+          <w:tcPr>
+            <w:tcW w:w="0" w:type="auto"/>
+            <w:vAlign w:val="center"/>
+            <w:hideMark/>
+          </w:tcPr>
+          <w:p/>
+        </w:tc>
+        <w:tc>
+          <w:tcPr>
+            <w:tcW w:w="0" w:type="auto"/>
+            <w:vAlign w:val="center"/>
+            <w:hideMark/>
+          </w:tcPr>
+          <w:p>
+            <w:r>
+              <w:t>Fecha y hora de creación</w:t>
+            </w:r>
+          </w:p>
+        </w:tc>
+      </w:tr>
+      <w:tr>
+        <w:trPr>
+          <w:tblCellSpacing w:w="15" w:type="dxa"/>
+        </w:trPr>
+        <w:tc>
+          <w:tcPr>
+            <w:tcW w:w="0" w:type="auto"/>
+            <w:vAlign w:val="center"/>
+            <w:hideMark/>
+          </w:tcPr>
+          <w:p>
+            <w:proofErr w:type="spellStart"/>
+            <w:r>
+              <w:t>id_incidencia</w:t>
+            </w:r>
+            <w:proofErr w:type="spellEnd"/>
+          </w:p>
+        </w:tc>
+        <w:tc>
+          <w:tcPr>
+            <w:tcW w:w="0" w:type="auto"/>
+            <w:vAlign w:val="center"/>
+            <w:hideMark/>
+          </w:tcPr>
+          <w:p>
+            <w:r>
+              <w:t>FK</w:t>
+            </w:r>
+          </w:p>
+        </w:tc>
+        <w:tc>
+          <w:tcPr>
+            <w:tcW w:w="0" w:type="auto"/>
+            <w:vAlign w:val="center"/>
+            <w:hideMark/>
+          </w:tcPr>
+          <w:p>
+            <w:r>
+              <w:t>Incidencia asociada</w:t>
+            </w:r>
+          </w:p>
+        </w:tc>
+      </w:tr>
+      <w:tr>
+        <w:trPr>
+          <w:tblCellSpacing w:w="15" w:type="dxa"/>
+        </w:trPr>
+        <w:tc>
+          <w:tcPr>
+            <w:tcW w:w="0" w:type="auto"/>
+            <w:vAlign w:val="center"/>
+            <w:hideMark/>
+          </w:tcPr>
+          <w:p>
+            <w:proofErr w:type="spellStart"/>
+            <w:r>
+              <w:t>id_usuario</w:t>
+            </w:r>
+            <w:proofErr w:type="spellEnd"/>
+          </w:p>
+        </w:tc>
+        <w:tc>
+          <w:tcPr>
+            <w:tcW w:w="0" w:type="auto"/>
+            <w:vAlign w:val="center"/>
+            <w:hideMark/>
+          </w:tcPr>
+          <w:p>
+            <w:r>
+              <w:t>FK</w:t>
+            </w:r>
+          </w:p>
+        </w:tc>
+        <w:tc>
+          <w:tcPr>
+            <w:tcW w:w="0" w:type="auto"/>
+            <w:vAlign w:val="center"/>
+            <w:hideMark/>
+          </w:tcPr>
+          <w:p>
+            <w:r>
+              <w:t>Técnico que escribe la nota</w:t>
+            </w:r>
+          </w:p>
+        </w:tc>
+      </w:tr>
+    </w:tbl>
+    <w:p>
+      <w:pPr>
+        <w:rPr>
+          <w:b/>
+          <w:bCs/>
+        </w:rPr>
+      </w:pPr>
+    </w:p>
+    <w:p>
+      <w:pPr>
+        <w:rPr>
+          <w:b/>
+          <w:bCs/>
+        </w:rPr>
+      </w:pPr>
+      <w:r>
+        <w:rPr>
+          <w:b/>
+          <w:bCs/>
+        </w:rPr>
         <w:br w:type="page"/>
       </w:r>
     </w:p>
@@ -3761,8 +4584,8 @@
         <w:tblLook w:val="04A0" w:firstRow="1" w:lastRow="0" w:firstColumn="1" w:lastColumn="0" w:noHBand="0" w:noVBand="1"/>
       </w:tblPr>
       <w:tblGrid>
-        <w:gridCol w:w="3047"/>
-        <w:gridCol w:w="3484"/>
+        <w:gridCol w:w="3996"/>
+        <w:gridCol w:w="2535"/>
       </w:tblGrid>
       <w:tr>
         <w:trPr>
@@ -3952,6 +4775,36 @@
           <w:tcPr>
             <w:tcW w:w="0" w:type="auto"/>
             <w:vAlign w:val="center"/>
+          </w:tcPr>
+          <w:p>
+            <w:r>
+              <w:t>NOTA_INTERNA</w:t>
+            </w:r>
+          </w:p>
+        </w:tc>
+        <w:tc>
+          <w:tcPr>
+            <w:tcW w:w="0" w:type="auto"/>
+            <w:vAlign w:val="center"/>
+          </w:tcPr>
+          <w:p>
+            <w:proofErr w:type="spellStart"/>
+            <w:r>
+              <w:t>id_nota</w:t>
+            </w:r>
+            <w:proofErr w:type="spellEnd"/>
+          </w:p>
+        </w:tc>
+      </w:tr>
+      <w:tr>
+        <w:trPr>
+          <w:trHeight w:val="505"/>
+          <w:tblCellSpacing w:w="15" w:type="dxa"/>
+        </w:trPr>
+        <w:tc>
+          <w:tcPr>
+            <w:tcW w:w="0" w:type="auto"/>
+            <w:vAlign w:val="center"/>
             <w:hideMark/>
           </w:tcPr>
           <w:p>
@@ -3970,6 +4823,96 @@
             <w:proofErr w:type="spellStart"/>
             <w:r>
               <w:t>id_asignacion</w:t>
+            </w:r>
+            <w:proofErr w:type="spellEnd"/>
+          </w:p>
+        </w:tc>
+      </w:tr>
+      <w:tr>
+        <w:trPr>
+          <w:trHeight w:val="505"/>
+          <w:tblCellSpacing w:w="15" w:type="dxa"/>
+        </w:trPr>
+        <w:tc>
+          <w:tcPr>
+            <w:tcW w:w="0" w:type="auto"/>
+            <w:vAlign w:val="center"/>
+          </w:tcPr>
+          <w:p>
+            <w:r>
+              <w:t>INFORME_RESOLUCION</w:t>
+            </w:r>
+          </w:p>
+        </w:tc>
+        <w:tc>
+          <w:tcPr>
+            <w:tcW w:w="0" w:type="auto"/>
+            <w:vAlign w:val="center"/>
+          </w:tcPr>
+          <w:p>
+            <w:proofErr w:type="spellStart"/>
+            <w:r>
+              <w:t>id_informe</w:t>
+            </w:r>
+            <w:proofErr w:type="spellEnd"/>
+          </w:p>
+        </w:tc>
+      </w:tr>
+      <w:tr>
+        <w:trPr>
+          <w:trHeight w:val="505"/>
+          <w:tblCellSpacing w:w="15" w:type="dxa"/>
+        </w:trPr>
+        <w:tc>
+          <w:tcPr>
+            <w:tcW w:w="0" w:type="auto"/>
+            <w:vAlign w:val="center"/>
+          </w:tcPr>
+          <w:p>
+            <w:r>
+              <w:t>HISTORIAL_INCIDENCIA</w:t>
+            </w:r>
+          </w:p>
+        </w:tc>
+        <w:tc>
+          <w:tcPr>
+            <w:tcW w:w="0" w:type="auto"/>
+            <w:vAlign w:val="center"/>
+          </w:tcPr>
+          <w:p>
+            <w:proofErr w:type="spellStart"/>
+            <w:r>
+              <w:t>id_historial</w:t>
+            </w:r>
+            <w:proofErr w:type="spellEnd"/>
+          </w:p>
+        </w:tc>
+      </w:tr>
+      <w:tr>
+        <w:trPr>
+          <w:trHeight w:val="505"/>
+          <w:tblCellSpacing w:w="15" w:type="dxa"/>
+        </w:trPr>
+        <w:tc>
+          <w:tcPr>
+            <w:tcW w:w="0" w:type="auto"/>
+            <w:vAlign w:val="center"/>
+          </w:tcPr>
+          <w:p>
+            <w:r>
+              <w:t>AUDITORIA</w:t>
+            </w:r>
+          </w:p>
+        </w:tc>
+        <w:tc>
+          <w:tcPr>
+            <w:tcW w:w="0" w:type="auto"/>
+            <w:vAlign w:val="center"/>
+          </w:tcPr>
+          <w:p>
+            <w:proofErr w:type="spellStart"/>
+            <w:r>
+              <w:t>id_auditoria</w:t>
             </w:r>
             <w:proofErr w:type="spellEnd"/>
           </w:p>
@@ -4006,7 +4949,7 @@
     </w:p>
     <w:tbl>
       <w:tblPr>
-        <w:tblW w:w="8330" w:type="dxa"/>
+        <w:tblW w:w="0" w:type="auto"/>
         <w:tblCellSpacing w:w="15" w:type="dxa"/>
         <w:tblCellMar>
           <w:top w:w="15" w:type="dxa"/>
@@ -4017,19 +4960,18 @@
         <w:tblLook w:val="04A0" w:firstRow="1" w:lastRow="0" w:firstColumn="1" w:lastColumn="0" w:noHBand="0" w:noVBand="1"/>
       </w:tblPr>
       <w:tblGrid>
-        <w:gridCol w:w="3068"/>
-        <w:gridCol w:w="1849"/>
-        <w:gridCol w:w="3413"/>
+        <w:gridCol w:w="3261"/>
+        <w:gridCol w:w="2057"/>
+        <w:gridCol w:w="2892"/>
       </w:tblGrid>
       <w:tr>
         <w:trPr>
-          <w:trHeight w:val="456"/>
           <w:tblHeader/>
           <w:tblCellSpacing w:w="15" w:type="dxa"/>
         </w:trPr>
         <w:tc>
           <w:tcPr>
-            <w:tcW w:w="0" w:type="auto"/>
+            <w:tcW w:w="3216" w:type="dxa"/>
             <w:vAlign w:val="center"/>
             <w:hideMark/>
           </w:tcPr>
@@ -4051,7 +4993,7 @@
         </w:tc>
         <w:tc>
           <w:tcPr>
-            <w:tcW w:w="0" w:type="auto"/>
+            <w:tcW w:w="1392" w:type="dxa"/>
             <w:vAlign w:val="center"/>
             <w:hideMark/>
           </w:tcPr>
@@ -4096,12 +5038,11 @@
       </w:tr>
       <w:tr>
         <w:trPr>
-          <w:trHeight w:val="465"/>
-          <w:tblCellSpacing w:w="15" w:type="dxa"/>
-        </w:trPr>
-        <w:tc>
-          <w:tcPr>
-            <w:tcW w:w="0" w:type="auto"/>
+          <w:tblCellSpacing w:w="15" w:type="dxa"/>
+        </w:trPr>
+        <w:tc>
+          <w:tcPr>
+            <w:tcW w:w="3216" w:type="dxa"/>
             <w:vAlign w:val="center"/>
             <w:hideMark/>
           </w:tcPr>
@@ -4113,7 +5054,7 @@
         </w:tc>
         <w:tc>
           <w:tcPr>
-            <w:tcW w:w="0" w:type="auto"/>
+            <w:tcW w:w="1392" w:type="dxa"/>
             <w:vAlign w:val="center"/>
             <w:hideMark/>
           </w:tcPr>
@@ -4150,12 +5091,11 @@
       </w:tr>
       <w:tr>
         <w:trPr>
-          <w:trHeight w:val="465"/>
-          <w:tblCellSpacing w:w="15" w:type="dxa"/>
-        </w:trPr>
-        <w:tc>
-          <w:tcPr>
-            <w:tcW w:w="0" w:type="auto"/>
+          <w:tblCellSpacing w:w="15" w:type="dxa"/>
+        </w:trPr>
+        <w:tc>
+          <w:tcPr>
+            <w:tcW w:w="3216" w:type="dxa"/>
             <w:vAlign w:val="center"/>
             <w:hideMark/>
           </w:tcPr>
@@ -4167,7 +5107,7 @@
         </w:tc>
         <w:tc>
           <w:tcPr>
-            <w:tcW w:w="0" w:type="auto"/>
+            <w:tcW w:w="1392" w:type="dxa"/>
             <w:vAlign w:val="center"/>
             <w:hideMark/>
           </w:tcPr>
@@ -4204,12 +5144,11 @@
       </w:tr>
       <w:tr>
         <w:trPr>
-          <w:trHeight w:val="465"/>
-          <w:tblCellSpacing w:w="15" w:type="dxa"/>
-        </w:trPr>
-        <w:tc>
-          <w:tcPr>
-            <w:tcW w:w="0" w:type="auto"/>
+          <w:tblCellSpacing w:w="15" w:type="dxa"/>
+        </w:trPr>
+        <w:tc>
+          <w:tcPr>
+            <w:tcW w:w="3216" w:type="dxa"/>
             <w:vAlign w:val="center"/>
             <w:hideMark/>
           </w:tcPr>
@@ -4221,7 +5160,7 @@
         </w:tc>
         <w:tc>
           <w:tcPr>
-            <w:tcW w:w="0" w:type="auto"/>
+            <w:tcW w:w="1392" w:type="dxa"/>
             <w:vAlign w:val="center"/>
             <w:hideMark/>
           </w:tcPr>
@@ -4258,31 +5197,30 @@
       </w:tr>
       <w:tr>
         <w:trPr>
-          <w:trHeight w:val="465"/>
-          <w:tblCellSpacing w:w="15" w:type="dxa"/>
-        </w:trPr>
-        <w:tc>
-          <w:tcPr>
-            <w:tcW w:w="0" w:type="auto"/>
-            <w:vAlign w:val="center"/>
-            <w:hideMark/>
-          </w:tcPr>
-          <w:p>
-            <w:r>
-              <w:t>ASIGNACION</w:t>
-            </w:r>
-          </w:p>
-        </w:tc>
-        <w:tc>
-          <w:tcPr>
-            <w:tcW w:w="0" w:type="auto"/>
+          <w:tblCellSpacing w:w="15" w:type="dxa"/>
+        </w:trPr>
+        <w:tc>
+          <w:tcPr>
+            <w:tcW w:w="3216" w:type="dxa"/>
+            <w:vAlign w:val="center"/>
+            <w:hideMark/>
+          </w:tcPr>
+          <w:p>
+            <w:r>
+              <w:t>INCIDENCIA</w:t>
+            </w:r>
+          </w:p>
+        </w:tc>
+        <w:tc>
+          <w:tcPr>
+            <w:tcW w:w="1392" w:type="dxa"/>
             <w:vAlign w:val="center"/>
             <w:hideMark/>
           </w:tcPr>
           <w:p>
             <w:proofErr w:type="spellStart"/>
             <w:r>
-              <w:t>id_incidencia</w:t>
+              <w:t>id_usuario_creador</w:t>
             </w:r>
             <w:proofErr w:type="spellEnd"/>
           </w:p>
@@ -4296,12 +5234,12 @@
           <w:p>
             <w:proofErr w:type="gramStart"/>
             <w:r>
-              <w:t>INCIDENCIA(</w:t>
+              <w:t>USUARIO(</w:t>
             </w:r>
             <w:proofErr w:type="spellStart"/>
             <w:proofErr w:type="gramEnd"/>
             <w:r>
-              <w:t>id_incidencia</w:t>
+              <w:t>id_usuario</w:t>
             </w:r>
             <w:proofErr w:type="spellEnd"/>
             <w:r>
@@ -4312,31 +5250,30 @@
       </w:tr>
       <w:tr>
         <w:trPr>
-          <w:trHeight w:val="465"/>
-          <w:tblCellSpacing w:w="15" w:type="dxa"/>
-        </w:trPr>
-        <w:tc>
-          <w:tcPr>
-            <w:tcW w:w="0" w:type="auto"/>
-            <w:vAlign w:val="center"/>
-            <w:hideMark/>
-          </w:tcPr>
-          <w:p>
-            <w:r>
-              <w:t>HISTORIAL_INCIDENCIA</w:t>
-            </w:r>
-          </w:p>
-        </w:tc>
-        <w:tc>
-          <w:tcPr>
-            <w:tcW w:w="0" w:type="auto"/>
+          <w:tblCellSpacing w:w="15" w:type="dxa"/>
+        </w:trPr>
+        <w:tc>
+          <w:tcPr>
+            <w:tcW w:w="3216" w:type="dxa"/>
+            <w:vAlign w:val="center"/>
+            <w:hideMark/>
+          </w:tcPr>
+          <w:p>
+            <w:r>
+              <w:t>INCIDENCIA</w:t>
+            </w:r>
+          </w:p>
+        </w:tc>
+        <w:tc>
+          <w:tcPr>
+            <w:tcW w:w="1392" w:type="dxa"/>
             <w:vAlign w:val="center"/>
             <w:hideMark/>
           </w:tcPr>
           <w:p>
             <w:proofErr w:type="spellStart"/>
             <w:r>
-              <w:t>id_usuario</w:t>
+              <w:t>id_usuario_cierre</w:t>
             </w:r>
             <w:proofErr w:type="spellEnd"/>
           </w:p>
@@ -4364,13 +5301,493 @@
           </w:p>
         </w:tc>
       </w:tr>
+      <w:tr>
+        <w:trPr>
+          <w:tblCellSpacing w:w="15" w:type="dxa"/>
+        </w:trPr>
+        <w:tc>
+          <w:tcPr>
+            <w:tcW w:w="3216" w:type="dxa"/>
+            <w:vAlign w:val="center"/>
+            <w:hideMark/>
+          </w:tcPr>
+          <w:p>
+            <w:r>
+              <w:t>ASIGNACION</w:t>
+            </w:r>
+          </w:p>
+        </w:tc>
+        <w:tc>
+          <w:tcPr>
+            <w:tcW w:w="1392" w:type="dxa"/>
+            <w:vAlign w:val="center"/>
+            <w:hideMark/>
+          </w:tcPr>
+          <w:p>
+            <w:proofErr w:type="spellStart"/>
+            <w:r>
+              <w:t>id_incidencia</w:t>
+            </w:r>
+            <w:proofErr w:type="spellEnd"/>
+          </w:p>
+        </w:tc>
+        <w:tc>
+          <w:tcPr>
+            <w:tcW w:w="0" w:type="auto"/>
+            <w:vAlign w:val="center"/>
+            <w:hideMark/>
+          </w:tcPr>
+          <w:p>
+            <w:proofErr w:type="gramStart"/>
+            <w:r>
+              <w:t>INCIDENCIA(</w:t>
+            </w:r>
+            <w:proofErr w:type="spellStart"/>
+            <w:proofErr w:type="gramEnd"/>
+            <w:r>
+              <w:t>id_incidencia</w:t>
+            </w:r>
+            <w:proofErr w:type="spellEnd"/>
+            <w:r>
+              <w:t>)</w:t>
+            </w:r>
+          </w:p>
+        </w:tc>
+      </w:tr>
+      <w:tr>
+        <w:trPr>
+          <w:tblCellSpacing w:w="15" w:type="dxa"/>
+        </w:trPr>
+        <w:tc>
+          <w:tcPr>
+            <w:tcW w:w="3216" w:type="dxa"/>
+            <w:vAlign w:val="center"/>
+            <w:hideMark/>
+          </w:tcPr>
+          <w:p>
+            <w:r>
+              <w:t>ASIGNACION</w:t>
+            </w:r>
+          </w:p>
+        </w:tc>
+        <w:tc>
+          <w:tcPr>
+            <w:tcW w:w="1392" w:type="dxa"/>
+            <w:vAlign w:val="center"/>
+            <w:hideMark/>
+          </w:tcPr>
+          <w:p>
+            <w:proofErr w:type="spellStart"/>
+            <w:r>
+              <w:t>id_usuario_st</w:t>
+            </w:r>
+            <w:proofErr w:type="spellEnd"/>
+          </w:p>
+        </w:tc>
+        <w:tc>
+          <w:tcPr>
+            <w:tcW w:w="0" w:type="auto"/>
+            <w:vAlign w:val="center"/>
+            <w:hideMark/>
+          </w:tcPr>
+          <w:p>
+            <w:proofErr w:type="gramStart"/>
+            <w:r>
+              <w:t>USUARIO(</w:t>
+            </w:r>
+            <w:proofErr w:type="spellStart"/>
+            <w:proofErr w:type="gramEnd"/>
+            <w:r>
+              <w:t>id_usuario</w:t>
+            </w:r>
+            <w:proofErr w:type="spellEnd"/>
+            <w:r>
+              <w:t>)</w:t>
+            </w:r>
+          </w:p>
+        </w:tc>
+      </w:tr>
+      <w:tr>
+        <w:trPr>
+          <w:tblCellSpacing w:w="15" w:type="dxa"/>
+        </w:trPr>
+        <w:tc>
+          <w:tcPr>
+            <w:tcW w:w="3216" w:type="dxa"/>
+            <w:vAlign w:val="center"/>
+            <w:hideMark/>
+          </w:tcPr>
+          <w:p>
+            <w:r>
+              <w:lastRenderedPageBreak/>
+              <w:t>INFORME_RESOLUCION</w:t>
+            </w:r>
+          </w:p>
+        </w:tc>
+        <w:tc>
+          <w:tcPr>
+            <w:tcW w:w="1392" w:type="dxa"/>
+            <w:vAlign w:val="center"/>
+            <w:hideMark/>
+          </w:tcPr>
+          <w:p>
+            <w:proofErr w:type="spellStart"/>
+            <w:r>
+              <w:t>id_incidencia</w:t>
+            </w:r>
+            <w:proofErr w:type="spellEnd"/>
+          </w:p>
+        </w:tc>
+        <w:tc>
+          <w:tcPr>
+            <w:tcW w:w="0" w:type="auto"/>
+            <w:vAlign w:val="center"/>
+            <w:hideMark/>
+          </w:tcPr>
+          <w:p>
+            <w:proofErr w:type="gramStart"/>
+            <w:r>
+              <w:t>INCIDENCIA(</w:t>
+            </w:r>
+            <w:proofErr w:type="spellStart"/>
+            <w:proofErr w:type="gramEnd"/>
+            <w:r>
+              <w:t>id_incidencia</w:t>
+            </w:r>
+            <w:proofErr w:type="spellEnd"/>
+            <w:r>
+              <w:t>)</w:t>
+            </w:r>
+          </w:p>
+        </w:tc>
+      </w:tr>
+      <w:tr>
+        <w:trPr>
+          <w:tblCellSpacing w:w="15" w:type="dxa"/>
+        </w:trPr>
+        <w:tc>
+          <w:tcPr>
+            <w:tcW w:w="3216" w:type="dxa"/>
+            <w:vAlign w:val="center"/>
+            <w:hideMark/>
+          </w:tcPr>
+          <w:p>
+            <w:r>
+              <w:t>INFORME_RESOLUCION</w:t>
+            </w:r>
+          </w:p>
+        </w:tc>
+        <w:tc>
+          <w:tcPr>
+            <w:tcW w:w="1392" w:type="dxa"/>
+            <w:vAlign w:val="center"/>
+            <w:hideMark/>
+          </w:tcPr>
+          <w:p>
+            <w:proofErr w:type="spellStart"/>
+            <w:r>
+              <w:t>id_usuario_st</w:t>
+            </w:r>
+            <w:proofErr w:type="spellEnd"/>
+          </w:p>
+        </w:tc>
+        <w:tc>
+          <w:tcPr>
+            <w:tcW w:w="0" w:type="auto"/>
+            <w:vAlign w:val="center"/>
+            <w:hideMark/>
+          </w:tcPr>
+          <w:p>
+            <w:proofErr w:type="gramStart"/>
+            <w:r>
+              <w:t>USUARIO(</w:t>
+            </w:r>
+            <w:proofErr w:type="spellStart"/>
+            <w:proofErr w:type="gramEnd"/>
+            <w:r>
+              <w:t>id_usuario</w:t>
+            </w:r>
+            <w:proofErr w:type="spellEnd"/>
+            <w:r>
+              <w:t>)</w:t>
+            </w:r>
+          </w:p>
+        </w:tc>
+      </w:tr>
+      <w:tr>
+        <w:trPr>
+          <w:tblCellSpacing w:w="15" w:type="dxa"/>
+        </w:trPr>
+        <w:tc>
+          <w:tcPr>
+            <w:tcW w:w="3216" w:type="dxa"/>
+            <w:vAlign w:val="center"/>
+            <w:hideMark/>
+          </w:tcPr>
+          <w:p>
+            <w:r>
+              <w:t>HISTORIAL_INCIDENCIA</w:t>
+            </w:r>
+          </w:p>
+        </w:tc>
+        <w:tc>
+          <w:tcPr>
+            <w:tcW w:w="1392" w:type="dxa"/>
+            <w:vAlign w:val="center"/>
+            <w:hideMark/>
+          </w:tcPr>
+          <w:p>
+            <w:proofErr w:type="spellStart"/>
+            <w:r>
+              <w:t>id_incidencia</w:t>
+            </w:r>
+            <w:proofErr w:type="spellEnd"/>
+          </w:p>
+        </w:tc>
+        <w:tc>
+          <w:tcPr>
+            <w:tcW w:w="0" w:type="auto"/>
+            <w:vAlign w:val="center"/>
+            <w:hideMark/>
+          </w:tcPr>
+          <w:p>
+            <w:proofErr w:type="gramStart"/>
+            <w:r>
+              <w:t>INCIDENCIA(</w:t>
+            </w:r>
+            <w:proofErr w:type="spellStart"/>
+            <w:proofErr w:type="gramEnd"/>
+            <w:r>
+              <w:t>id_incidencia</w:t>
+            </w:r>
+            <w:proofErr w:type="spellEnd"/>
+            <w:r>
+              <w:t>)</w:t>
+            </w:r>
+          </w:p>
+        </w:tc>
+      </w:tr>
+      <w:tr>
+        <w:trPr>
+          <w:tblCellSpacing w:w="15" w:type="dxa"/>
+        </w:trPr>
+        <w:tc>
+          <w:tcPr>
+            <w:tcW w:w="3216" w:type="dxa"/>
+            <w:vAlign w:val="center"/>
+            <w:hideMark/>
+          </w:tcPr>
+          <w:p>
+            <w:r>
+              <w:t>HISTORIAL_INCIDENCIA</w:t>
+            </w:r>
+          </w:p>
+        </w:tc>
+        <w:tc>
+          <w:tcPr>
+            <w:tcW w:w="1392" w:type="dxa"/>
+            <w:vAlign w:val="center"/>
+            <w:hideMark/>
+          </w:tcPr>
+          <w:p>
+            <w:proofErr w:type="spellStart"/>
+            <w:r>
+              <w:t>id_usuario</w:t>
+            </w:r>
+            <w:proofErr w:type="spellEnd"/>
+          </w:p>
+        </w:tc>
+        <w:tc>
+          <w:tcPr>
+            <w:tcW w:w="0" w:type="auto"/>
+            <w:vAlign w:val="center"/>
+            <w:hideMark/>
+          </w:tcPr>
+          <w:p>
+            <w:proofErr w:type="gramStart"/>
+            <w:r>
+              <w:t>USUARIO(</w:t>
+            </w:r>
+            <w:proofErr w:type="spellStart"/>
+            <w:proofErr w:type="gramEnd"/>
+            <w:r>
+              <w:t>id_usuario</w:t>
+            </w:r>
+            <w:proofErr w:type="spellEnd"/>
+            <w:r>
+              <w:t>)</w:t>
+            </w:r>
+          </w:p>
+        </w:tc>
+      </w:tr>
+      <w:tr>
+        <w:trPr>
+          <w:tblCellSpacing w:w="15" w:type="dxa"/>
+        </w:trPr>
+        <w:tc>
+          <w:tcPr>
+            <w:tcW w:w="3216" w:type="dxa"/>
+            <w:vAlign w:val="center"/>
+            <w:hideMark/>
+          </w:tcPr>
+          <w:p>
+            <w:r>
+              <w:t>NOTA_INTERNA</w:t>
+            </w:r>
+          </w:p>
+        </w:tc>
+        <w:tc>
+          <w:tcPr>
+            <w:tcW w:w="1392" w:type="dxa"/>
+            <w:vAlign w:val="center"/>
+            <w:hideMark/>
+          </w:tcPr>
+          <w:p>
+            <w:proofErr w:type="spellStart"/>
+            <w:r>
+              <w:t>id_incidencia</w:t>
+            </w:r>
+            <w:proofErr w:type="spellEnd"/>
+          </w:p>
+        </w:tc>
+        <w:tc>
+          <w:tcPr>
+            <w:tcW w:w="0" w:type="auto"/>
+            <w:vAlign w:val="center"/>
+            <w:hideMark/>
+          </w:tcPr>
+          <w:p>
+            <w:proofErr w:type="gramStart"/>
+            <w:r>
+              <w:t>INCIDENCIA(</w:t>
+            </w:r>
+            <w:proofErr w:type="spellStart"/>
+            <w:proofErr w:type="gramEnd"/>
+            <w:r>
+              <w:t>id_incidencia</w:t>
+            </w:r>
+            <w:proofErr w:type="spellEnd"/>
+            <w:r>
+              <w:t>)</w:t>
+            </w:r>
+          </w:p>
+        </w:tc>
+      </w:tr>
+      <w:tr>
+        <w:trPr>
+          <w:tblCellSpacing w:w="15" w:type="dxa"/>
+        </w:trPr>
+        <w:tc>
+          <w:tcPr>
+            <w:tcW w:w="3216" w:type="dxa"/>
+            <w:vAlign w:val="center"/>
+            <w:hideMark/>
+          </w:tcPr>
+          <w:p>
+            <w:r>
+              <w:t>NOTA_INTERNA</w:t>
+            </w:r>
+          </w:p>
+        </w:tc>
+        <w:tc>
+          <w:tcPr>
+            <w:tcW w:w="1392" w:type="dxa"/>
+            <w:vAlign w:val="center"/>
+            <w:hideMark/>
+          </w:tcPr>
+          <w:p>
+            <w:proofErr w:type="spellStart"/>
+            <w:r>
+              <w:t>id_usuario</w:t>
+            </w:r>
+            <w:proofErr w:type="spellEnd"/>
+          </w:p>
+        </w:tc>
+        <w:tc>
+          <w:tcPr>
+            <w:tcW w:w="0" w:type="auto"/>
+            <w:vAlign w:val="center"/>
+            <w:hideMark/>
+          </w:tcPr>
+          <w:p>
+            <w:proofErr w:type="gramStart"/>
+            <w:r>
+              <w:t>USUARIO(</w:t>
+            </w:r>
+            <w:proofErr w:type="spellStart"/>
+            <w:proofErr w:type="gramEnd"/>
+            <w:r>
+              <w:t>id_usuario</w:t>
+            </w:r>
+            <w:proofErr w:type="spellEnd"/>
+            <w:r>
+              <w:t>)</w:t>
+            </w:r>
+          </w:p>
+        </w:tc>
+      </w:tr>
+      <w:tr>
+        <w:trPr>
+          <w:tblCellSpacing w:w="15" w:type="dxa"/>
+        </w:trPr>
+        <w:tc>
+          <w:tcPr>
+            <w:tcW w:w="3216" w:type="dxa"/>
+            <w:vAlign w:val="center"/>
+            <w:hideMark/>
+          </w:tcPr>
+          <w:p>
+            <w:r>
+              <w:t>AUDITORIA</w:t>
+            </w:r>
+          </w:p>
+        </w:tc>
+        <w:tc>
+          <w:tcPr>
+            <w:tcW w:w="1392" w:type="dxa"/>
+            <w:vAlign w:val="center"/>
+            <w:hideMark/>
+          </w:tcPr>
+          <w:p>
+            <w:proofErr w:type="spellStart"/>
+            <w:r>
+              <w:t>id_usuario</w:t>
+            </w:r>
+            <w:proofErr w:type="spellEnd"/>
+          </w:p>
+        </w:tc>
+        <w:tc>
+          <w:tcPr>
+            <w:tcW w:w="0" w:type="auto"/>
+            <w:vAlign w:val="center"/>
+            <w:hideMark/>
+          </w:tcPr>
+          <w:p>
+            <w:proofErr w:type="gramStart"/>
+            <w:r>
+              <w:t>USUARIO(</w:t>
+            </w:r>
+            <w:proofErr w:type="spellStart"/>
+            <w:proofErr w:type="gramEnd"/>
+            <w:r>
+              <w:t>id_usuario</w:t>
+            </w:r>
+            <w:proofErr w:type="spellEnd"/>
+            <w:r>
+              <w:t>)</w:t>
+            </w:r>
+          </w:p>
+        </w:tc>
+      </w:tr>
     </w:tbl>
     <w:p>
-      <w:r>
-        <w:t>Gracias a estas restricciones no es posible insertar registros con referencias inexistentes.</w:t>
-      </w:r>
+      <w:pPr>
+        <w:rPr>
+          <w:b/>
+          <w:bCs/>
+        </w:rPr>
+      </w:pPr>
     </w:p>
-    <w:p/>
     <w:p>
       <w:pPr>
         <w:rPr>
@@ -4399,6 +5816,147 @@
           <w:bCs/>
         </w:rPr>
       </w:pPr>
+      <w:r>
+        <w:rPr>
+          <w:b/>
+          <w:bCs/>
+        </w:rPr>
+        <w:t>Restricciones UNIQUE</w:t>
+      </w:r>
+    </w:p>
+    <w:p>
+      <w:r>
+        <w:t>Garantizan valores únicos en:</w:t>
+      </w:r>
+    </w:p>
+    <w:p>
+      <w:pPr>
+        <w:numPr>
+          <w:ilvl w:val="0"/>
+          <w:numId w:val="6"/>
+        </w:numPr>
+      </w:pPr>
+      <w:proofErr w:type="spellStart"/>
+      <w:r>
+        <w:t>username</w:t>
+      </w:r>
+      <w:proofErr w:type="spellEnd"/>
+      <w:r>
+        <w:t xml:space="preserve"> </w:t>
+      </w:r>
+    </w:p>
+    <w:p>
+      <w:pPr>
+        <w:numPr>
+          <w:ilvl w:val="0"/>
+          <w:numId w:val="6"/>
+        </w:numPr>
+      </w:pPr>
+      <w:proofErr w:type="spellStart"/>
+      <w:r>
+        <w:t>codigo_puesto</w:t>
+      </w:r>
+      <w:proofErr w:type="spellEnd"/>
+      <w:r>
+        <w:t xml:space="preserve"> </w:t>
+      </w:r>
+    </w:p>
+    <w:p>
+      <w:pPr>
+        <w:numPr>
+          <w:ilvl w:val="0"/>
+          <w:numId w:val="6"/>
+        </w:numPr>
+      </w:pPr>
+      <w:proofErr w:type="spellStart"/>
+      <w:r>
+        <w:t>nombre_rol</w:t>
+      </w:r>
+      <w:proofErr w:type="spellEnd"/>
+    </w:p>
+    <w:p>
+      <w:pPr>
+        <w:numPr>
+          <w:ilvl w:val="0"/>
+          <w:numId w:val="6"/>
+        </w:numPr>
+      </w:pPr>
+      <w:proofErr w:type="spellStart"/>
+      <w:r>
+        <w:t>id_incidencia</w:t>
+      </w:r>
+      <w:proofErr w:type="spellEnd"/>
+    </w:p>
+    <w:p/>
+    <w:p>
+      <w:pPr>
+        <w:rPr>
+          <w:b/>
+          <w:bCs/>
+        </w:rPr>
+      </w:pPr>
+      <w:r>
+        <w:rPr>
+          <w:b/>
+          <w:bCs/>
+        </w:rPr>
+        <w:t>Restricciones CHECK</w:t>
+      </w:r>
+    </w:p>
+    <w:p>
+      <w:r>
+        <w:t>Se han utilizado restricciones CHECK para limitar los valores posibles de determinados campos.</w:t>
+      </w:r>
+    </w:p>
+    <w:p>
+      <w:pPr>
+        <w:ind w:firstLine="708"/>
+        <w:rPr>
+          <w:b/>
+          <w:bCs/>
+        </w:rPr>
+      </w:pPr>
+      <w:r>
+        <w:rPr>
+          <w:b/>
+          <w:bCs/>
+        </w:rPr>
+        <w:t>Prioridad de incidencias</w:t>
+      </w:r>
+    </w:p>
+    <w:p>
+      <w:r>
+        <w:t>CHECK (prioridad IN ('BAJA', 'MEDIA', 'ALTA', 'CRITICA'))</w:t>
+      </w:r>
+    </w:p>
+    <w:p>
+      <w:pPr>
+        <w:ind w:firstLine="708"/>
+        <w:rPr>
+          <w:b/>
+          <w:bCs/>
+        </w:rPr>
+      </w:pPr>
+      <w:r>
+        <w:rPr>
+          <w:b/>
+          <w:bCs/>
+        </w:rPr>
+        <w:t>Estado de incidencias</w:t>
+      </w:r>
+    </w:p>
+    <w:p>
+      <w:r>
+        <w:t>CHECK (estado IN ('ACTIVA', 'EN_CURSO', 'RESUELTA', 'REABIERTA', 'CANCELADA'))</w:t>
+      </w:r>
+    </w:p>
+    <w:p>
+      <w:pPr>
+        <w:rPr>
+          <w:b/>
+          <w:bCs/>
+        </w:rPr>
+      </w:pPr>
     </w:p>
     <w:p>
       <w:pPr>
@@ -4413,204 +5971,64 @@
           <w:bCs/>
         </w:rPr>
         <w:lastRenderedPageBreak/>
-        <w:t>Restricciones UNIQUE</w:t>
+        <w:t>INTEGRIDAD REFERENCIAL</w:t>
       </w:r>
     </w:p>
     <w:p>
       <w:r>
-        <w:t>Garantizan valores únicos en:</w:t>
+        <w:t>La integridad referencial garantiza la coherencia entre tablas evitando referencias inválidas.</w:t>
       </w:r>
     </w:p>
     <w:p>
+      <w:r>
+        <w:t>Ejemplos:</w:t>
+      </w:r>
+    </w:p>
+    <w:p>
       <w:pPr>
         <w:numPr>
           <w:ilvl w:val="0"/>
-          <w:numId w:val="6"/>
+          <w:numId w:val="7"/>
         </w:numPr>
       </w:pPr>
-      <w:proofErr w:type="spellStart"/>
-      <w:r>
-        <w:t>username</w:t>
-      </w:r>
-      <w:proofErr w:type="spellEnd"/>
-      <w:r>
-        <w:t xml:space="preserve"> </w:t>
+      <w:r>
+        <w:t xml:space="preserve">No puede existir una incidencia sin puesto asociado </w:t>
       </w:r>
     </w:p>
     <w:p>
       <w:pPr>
         <w:numPr>
           <w:ilvl w:val="0"/>
-          <w:numId w:val="6"/>
+          <w:numId w:val="7"/>
         </w:numPr>
       </w:pPr>
-      <w:proofErr w:type="spellStart"/>
-      <w:r>
-        <w:t>codigo_puesto</w:t>
-      </w:r>
-      <w:proofErr w:type="spellEnd"/>
-      <w:r>
-        <w:t xml:space="preserve"> </w:t>
+      <w:r>
+        <w:t xml:space="preserve">No puede asignarse un técnico inexistente </w:t>
       </w:r>
     </w:p>
     <w:p>
       <w:pPr>
         <w:numPr>
           <w:ilvl w:val="0"/>
-          <w:numId w:val="6"/>
+          <w:numId w:val="7"/>
         </w:numPr>
       </w:pPr>
-      <w:proofErr w:type="spellStart"/>
-      <w:r>
-        <w:t>nombre_rol</w:t>
-      </w:r>
-      <w:proofErr w:type="spellEnd"/>
+      <w:r>
+        <w:t xml:space="preserve">No puede existir historial de registros inexistentes </w:t>
+      </w:r>
+    </w:p>
+    <w:p>
+      <w:r>
+        <w:t>En algunas relaciones se utiliza ON DELETE CASCADE, como en asignaciones, para eliminar automáticamente registros dependientes y mantener la coherencia del sistema.</w:t>
+      </w:r>
     </w:p>
     <w:p/>
     <w:p>
-      <w:pPr>
+      <w:r>
         <w:rPr>
           <w:b/>
           <w:bCs/>
         </w:rPr>
-      </w:pPr>
-      <w:r>
-        <w:rPr>
-          <w:b/>
-          <w:bCs/>
-        </w:rPr>
-        <w:t>Restricciones CHECK</w:t>
-      </w:r>
-    </w:p>
-    <w:p>
-      <w:r>
-        <w:t>Se han utilizado restricciones CHECK para limitar los valores posibles de determinados campos.</w:t>
-      </w:r>
-    </w:p>
-    <w:p>
-      <w:pPr>
-        <w:ind w:firstLine="708"/>
-        <w:rPr>
-          <w:b/>
-          <w:bCs/>
-        </w:rPr>
-      </w:pPr>
-      <w:r>
-        <w:rPr>
-          <w:b/>
-          <w:bCs/>
-        </w:rPr>
-        <w:t>Prioridad de incidencias</w:t>
-      </w:r>
-    </w:p>
-    <w:p>
-      <w:r>
-        <w:t>CHECK (prioridad IN ('BAJA', 'MEDIA', 'ALTA', 'CRITICA'))</w:t>
-      </w:r>
-    </w:p>
-    <w:p>
-      <w:pPr>
-        <w:ind w:firstLine="708"/>
-        <w:rPr>
-          <w:b/>
-          <w:bCs/>
-        </w:rPr>
-      </w:pPr>
-      <w:r>
-        <w:rPr>
-          <w:b/>
-          <w:bCs/>
-        </w:rPr>
-        <w:t>Estado de incidencias</w:t>
-      </w:r>
-    </w:p>
-    <w:p>
-      <w:r>
-        <w:t>CHECK (estado IN ('ACTIVA', 'EN_CURSO', 'RESUELTA', 'REABIERTA', 'CANCELADA'))</w:t>
-      </w:r>
-    </w:p>
-    <w:p/>
-    <w:p>
-      <w:pPr>
-        <w:rPr>
-          <w:b/>
-          <w:bCs/>
-        </w:rPr>
-      </w:pPr>
-      <w:r>
-        <w:rPr>
-          <w:b/>
-          <w:bCs/>
-        </w:rPr>
-        <w:t>INTEGRIDAD REFERENCIAL</w:t>
-      </w:r>
-    </w:p>
-    <w:p>
-      <w:r>
-        <w:t>La integridad referencial garantiza la coherencia entre tablas evitando referencias inválidas.</w:t>
-      </w:r>
-    </w:p>
-    <w:p>
-      <w:r>
-        <w:t>Ejemplos:</w:t>
-      </w:r>
-    </w:p>
-    <w:p>
-      <w:pPr>
-        <w:numPr>
-          <w:ilvl w:val="0"/>
-          <w:numId w:val="7"/>
-        </w:numPr>
-      </w:pPr>
-      <w:r>
-        <w:t xml:space="preserve">No puede existir una incidencia sin puesto asociado </w:t>
-      </w:r>
-    </w:p>
-    <w:p>
-      <w:pPr>
-        <w:numPr>
-          <w:ilvl w:val="0"/>
-          <w:numId w:val="7"/>
-        </w:numPr>
-      </w:pPr>
-      <w:r>
-        <w:t xml:space="preserve">No puede asignarse un técnico inexistente </w:t>
-      </w:r>
-    </w:p>
-    <w:p>
-      <w:pPr>
-        <w:numPr>
-          <w:ilvl w:val="0"/>
-          <w:numId w:val="7"/>
-        </w:numPr>
-      </w:pPr>
-      <w:r>
-        <w:t xml:space="preserve">No puede existir historial de registros inexistentes </w:t>
-      </w:r>
-    </w:p>
-    <w:p>
-      <w:r>
-        <w:t>En algunas relaciones se utiliza ON DELETE CASCADE, como en asignaciones, para eliminar automáticamente registros dependientes y mantener la coherencia del sistema.</w:t>
-      </w:r>
-    </w:p>
-    <w:p>
-      <w:r>
-        <w:br w:type="page"/>
-      </w:r>
-    </w:p>
-    <w:p>
-      <w:pPr>
-        <w:rPr>
-          <w:b/>
-          <w:bCs/>
-        </w:rPr>
-      </w:pPr>
-      <w:r>
-        <w:rPr>
-          <w:b/>
-          <w:bCs/>
-        </w:rPr>
-        <w:lastRenderedPageBreak/>
         <w:t>INTEGRIDAD MEDIANTE TRIGGERS</w:t>
       </w:r>
     </w:p>
@@ -4654,7 +6072,10 @@
       </w:r>
       <w:proofErr w:type="spellEnd"/>
       <w:r>
-        <w:t xml:space="preserve">: registra cambios de estado en incidencias </w:t>
+        <w:t>: registra cambios de estado en incidencias</w:t>
+      </w:r>
+      <w:r>
+        <w:t>.</w:t>
       </w:r>
     </w:p>
     <w:p>
@@ -4674,7 +6095,10 @@
       </w:r>
       <w:proofErr w:type="spellEnd"/>
       <w:r>
-        <w:t xml:space="preserve">: registra asignaciones de técnicos </w:t>
+        <w:t>: registra asignaciones de técnicos</w:t>
+      </w:r>
+      <w:r>
+        <w:t>.</w:t>
       </w:r>
     </w:p>
     <w:p>
@@ -4694,7 +6118,10 @@
       </w:r>
       <w:proofErr w:type="spellEnd"/>
       <w:r>
-        <w:t xml:space="preserve">: impide cerrar incidencias sin informe </w:t>
+        <w:t>: impide cerrar incidencias sin informe</w:t>
+      </w:r>
+      <w:r>
+        <w:t>.</w:t>
       </w:r>
     </w:p>
     <w:p>
@@ -4714,7 +6141,10 @@
       </w:r>
       <w:proofErr w:type="spellEnd"/>
       <w:r>
-        <w:t xml:space="preserve">: gestiona fechas de atención, resolución y reapertura </w:t>
+        <w:t>: gestiona fechas de atención, resolución y reapertura</w:t>
+      </w:r>
+      <w:r>
+        <w:t>.</w:t>
       </w:r>
     </w:p>
     <w:p>
@@ -4734,166 +6164,188 @@
       </w:r>
       <w:proofErr w:type="spellEnd"/>
       <w:r>
+        <w:t>: genera auditor</w:t>
+      </w:r>
+      <w:r>
+        <w:t>ia de incidencias</w:t>
+      </w:r>
+      <w:r>
         <w:rPr>
           <w:b/>
           <w:bCs/>
         </w:rPr>
-        <w:t xml:space="preserve"> / usuario</w:t>
-      </w:r>
-      <w:r>
-        <w:t>: genera auditoría automática</w:t>
+        <w:t>.</w:t>
       </w:r>
     </w:p>
-    <w:p/>
     <w:p>
       <w:pPr>
+        <w:numPr>
+          <w:ilvl w:val="0"/>
+          <w:numId w:val="8"/>
+        </w:numPr>
+      </w:pPr>
+      <w:proofErr w:type="spellStart"/>
+      <w:r>
         <w:rPr>
           <w:b/>
           <w:bCs/>
         </w:rPr>
-      </w:pPr>
+        <w:t>trg_historial_insert</w:t>
+      </w:r>
+      <w:proofErr w:type="spellEnd"/>
       <w:r>
         <w:rPr>
           <w:b/>
           <w:bCs/>
         </w:rPr>
-        <w:t>RELACIONES DEL SISTEMA</w:t>
-      </w:r>
-    </w:p>
-    <w:p>
-      <w:pPr>
-        <w:numPr>
-          <w:ilvl w:val="0"/>
-          <w:numId w:val="9"/>
-        </w:numPr>
-      </w:pPr>
-      <w:r>
-        <w:t>Un rol puede tener múltiples usuarios (</w:t>
-      </w:r>
-      <w:proofErr w:type="gramStart"/>
-      <w:r>
-        <w:t>1:N</w:t>
-      </w:r>
-      <w:proofErr w:type="gramEnd"/>
-      <w:r>
-        <w:t xml:space="preserve">) </w:t>
-      </w:r>
-    </w:p>
-    <w:p>
-      <w:pPr>
-        <w:numPr>
-          <w:ilvl w:val="0"/>
-          <w:numId w:val="9"/>
-        </w:numPr>
-      </w:pPr>
-      <w:r>
-        <w:t>Un usuario puede crear múltiples incidencias (</w:t>
-      </w:r>
-      <w:proofErr w:type="gramStart"/>
-      <w:r>
-        <w:t>1:N</w:t>
-      </w:r>
-      <w:proofErr w:type="gramEnd"/>
-      <w:r>
-        <w:t xml:space="preserve">) </w:t>
-      </w:r>
-    </w:p>
-    <w:p>
-      <w:pPr>
-        <w:numPr>
-          <w:ilvl w:val="0"/>
-          <w:numId w:val="9"/>
-        </w:numPr>
-      </w:pPr>
-      <w:r>
-        <w:t>Un puesto puede generar múltiples incidencias (</w:t>
-      </w:r>
-      <w:proofErr w:type="gramStart"/>
-      <w:r>
-        <w:t>1:N</w:t>
-      </w:r>
-      <w:proofErr w:type="gramEnd"/>
-      <w:r>
-        <w:t xml:space="preserve">) </w:t>
-      </w:r>
-    </w:p>
-    <w:p>
-      <w:pPr>
-        <w:numPr>
-          <w:ilvl w:val="0"/>
-          <w:numId w:val="9"/>
-        </w:numPr>
-      </w:pPr>
-      <w:r>
-        <w:t>Una incidencia puede tener múltiples asignaciones (</w:t>
-      </w:r>
-      <w:proofErr w:type="gramStart"/>
-      <w:r>
-        <w:t>1:N</w:t>
-      </w:r>
-      <w:proofErr w:type="gramEnd"/>
-      <w:r>
-        <w:t xml:space="preserve">) </w:t>
-      </w:r>
-    </w:p>
-    <w:p>
-      <w:pPr>
-        <w:numPr>
-          <w:ilvl w:val="0"/>
-          <w:numId w:val="9"/>
-        </w:numPr>
-      </w:pPr>
-      <w:r>
-        <w:t xml:space="preserve">Una incidencia tiene un único informe de resolución (1:1) </w:t>
-      </w:r>
-    </w:p>
-    <w:p>
-      <w:pPr>
-        <w:numPr>
-          <w:ilvl w:val="0"/>
-          <w:numId w:val="9"/>
-        </w:numPr>
-      </w:pPr>
-      <w:r>
-        <w:t>Una incidencia puede tener múltiples registros de historial (</w:t>
-      </w:r>
-      <w:proofErr w:type="gramStart"/>
-      <w:r>
-        <w:t>1:N</w:t>
-      </w:r>
-      <w:proofErr w:type="gramEnd"/>
-      <w:r>
-        <w:t xml:space="preserve">) </w:t>
-      </w:r>
-    </w:p>
-    <w:p>
-      <w:pPr>
-        <w:numPr>
-          <w:ilvl w:val="0"/>
-          <w:numId w:val="9"/>
-        </w:numPr>
-      </w:pPr>
-      <w:r>
-        <w:t>Un usuario puede generar múltiples registros de auditoría (</w:t>
-      </w:r>
-      <w:proofErr w:type="gramStart"/>
-      <w:r>
-        <w:t>1:N</w:t>
-      </w:r>
-      <w:proofErr w:type="gramEnd"/>
-      <w:r>
-        <w:t>)</w:t>
+        <w:t>:</w:t>
+      </w:r>
+      <w:r>
+        <w:t xml:space="preserve"> registra automáticamente la creación de nuevas incidencias.</w:t>
       </w:r>
     </w:p>
     <w:p/>
     <w:sectPr>
+      <w:headerReference w:type="default" r:id="rId13"/>
+      <w:footerReference w:type="default" r:id="rId14"/>
       <w:pgSz w:w="11906" w:h="16838"/>
       <w:pgMar w:top="1417" w:right="1701" w:bottom="1417" w:left="1701" w:header="708" w:footer="708" w:gutter="0"/>
+      <w:pgNumType w:start="0"/>
       <w:cols w:space="708"/>
+      <w:titlePg/>
       <w:docGrid w:linePitch="360"/>
     </w:sectPr>
   </w:body>
 </w:document>
+</file>
+
+<file path=word/endnotes.xml><?xml version="1.0" encoding="utf-8"?>
+<w:endnotes xmlns:wpc="http://schemas.microsoft.com/office/word/2010/wordprocessingCanvas" xmlns:cx="http://schemas.microsoft.com/office/drawing/2014/chartex" xmlns:cx1="http://schemas.microsoft.com/office/drawing/2015/9/8/chartex" xmlns:cx2="http://schemas.microsoft.com/office/drawing/2015/10/21/chartex" xmlns:cx3="http://schemas.microsoft.com/office/drawing/2016/5/9/chartex" xmlns:cx4="http://schemas.microsoft.com/office/drawing/2016/5/10/chartex" xmlns:cx5="http://schemas.microsoft.com/office/drawing/2016/5/11/chartex" xmlns:cx6="http://schemas.microsoft.com/office/drawing/2016/5/12/chartex" xmlns:cx7="http://schemas.microsoft.com/office/drawing/2016/5/13/chartex" xmlns:cx8="http://schemas.microsoft.com/office/drawing/2016/5/14/chartex" xmlns:mc="http://schemas.openxmlformats.org/markup-compatibility/2006" xmlns:aink="http://schemas.microsoft.com/office/drawing/2016/ink" xmlns:am3d="http://schemas.microsoft.com/office/drawing/2017/model3d" xmlns:o="urn:schemas-microsoft-com:office:office" xmlns:oel="http://schemas.microsoft.com/office/2019/extlst" xmlns:r="http://schemas.openxmlformats.org/officeDocument/2006/relationships" xmlns:m="http://schemas.openxmlformats.org/officeDocument/2006/math" xmlns:v="urn:schemas-microsoft-com:vml" xmlns:wp14="http://schemas.microsoft.com/office/word/2010/wordprocessingDrawing" xmlns:wp="http://schemas.openxmlformats.org/drawingml/2006/wordprocessingDrawing" xmlns:w10="urn:schemas-microsoft-com:office:word" xmlns:w="http://schemas.openxmlformats.org/wordprocessingml/2006/main" xmlns:w14="http://schemas.microsoft.com/office/word/2010/wordml" xmlns:w15="http://schemas.microsoft.com/office/word/2012/wordml" xmlns:w16cex="http://schemas.microsoft.com/office/word/2018/wordml/cex" xmlns:w16cid="http://schemas.microsoft.com/office/word/2016/wordml/cid" xmlns:w16="http://schemas.microsoft.com/office/word/2018/wordml" xmlns:w16du="http://schemas.microsoft.com/office/word/2023/wordml/word16du" xmlns:w16sdtdh="http://schemas.microsoft.com/office/word/2020/wordml/sdtdatahash" xmlns:w16sdtfl="http://schemas.microsoft.com/office/word/2024/wordml/sdtformatlock" xmlns:w16se="http://schemas.microsoft.com/office/word/2015/wordml/symex" xmlns:wpg="http://schemas.microsoft.com/office/word/2010/wordprocessingGroup" xmlns:wpi="http://schemas.microsoft.com/office/word/2010/wordprocessingInk" xmlns:wne="http://schemas.microsoft.com/office/word/2006/wordml" xmlns:wps="http://schemas.microsoft.com/office/word/2010/wordprocessingShape" mc:Ignorable="w14 w15 w16se w16cid w16 w16cex w16sdtdh w16sdtfl w16du wp14">
+  <w:endnote w:type="separator" w:id="-1">
+    <w:p>
+      <w:pPr>
+        <w:spacing w:after="0" w:line="240" w:lineRule="auto"/>
+      </w:pPr>
+      <w:r>
+        <w:separator/>
+      </w:r>
+    </w:p>
+  </w:endnote>
+  <w:endnote w:type="continuationSeparator" w:id="0">
+    <w:p>
+      <w:pPr>
+        <w:spacing w:after="0" w:line="240" w:lineRule="auto"/>
+      </w:pPr>
+      <w:r>
+        <w:continuationSeparator/>
+      </w:r>
+    </w:p>
+  </w:endnote>
+</w:endnotes>
+</file>
+
+<file path=word/footer1.xml><?xml version="1.0" encoding="utf-8"?>
+<w:ftr xmlns:wpc="http://schemas.microsoft.com/office/word/2010/wordprocessingCanvas" xmlns:cx="http://schemas.microsoft.com/office/drawing/2014/chartex" xmlns:cx1="http://schemas.microsoft.com/office/drawing/2015/9/8/chartex" xmlns:cx2="http://schemas.microsoft.com/office/drawing/2015/10/21/chartex" xmlns:cx3="http://schemas.microsoft.com/office/drawing/2016/5/9/chartex" xmlns:cx4="http://schemas.microsoft.com/office/drawing/2016/5/10/chartex" xmlns:cx5="http://schemas.microsoft.com/office/drawing/2016/5/11/chartex" xmlns:cx6="http://schemas.microsoft.com/office/drawing/2016/5/12/chartex" xmlns:cx7="http://schemas.microsoft.com/office/drawing/2016/5/13/chartex" xmlns:cx8="http://schemas.microsoft.com/office/drawing/2016/5/14/chartex" xmlns:mc="http://schemas.openxmlformats.org/markup-compatibility/2006" xmlns:aink="http://schemas.microsoft.com/office/drawing/2016/ink" xmlns:am3d="http://schemas.microsoft.com/office/drawing/2017/model3d" xmlns:o="urn:schemas-microsoft-com:office:office" xmlns:oel="http://schemas.microsoft.com/office/2019/extlst" xmlns:r="http://schemas.openxmlformats.org/officeDocument/2006/relationships" xmlns:m="http://schemas.openxmlformats.org/officeDocument/2006/math" xmlns:v="urn:schemas-microsoft-com:vml" xmlns:wp14="http://schemas.microsoft.com/office/word/2010/wordprocessingDrawing" xmlns:wp="http://schemas.openxmlformats.org/drawingml/2006/wordprocessingDrawing" xmlns:w10="urn:schemas-microsoft-com:office:word" xmlns:w="http://schemas.openxmlformats.org/wordprocessingml/2006/main" xmlns:w14="http://schemas.microsoft.com/office/word/2010/wordml" xmlns:w15="http://schemas.microsoft.com/office/word/2012/wordml" xmlns:w16cex="http://schemas.microsoft.com/office/word/2018/wordml/cex" xmlns:w16cid="http://schemas.microsoft.com/office/word/2016/wordml/cid" xmlns:w16="http://schemas.microsoft.com/office/word/2018/wordml" xmlns:w16du="http://schemas.microsoft.com/office/word/2023/wordml/word16du" xmlns:w16sdtdh="http://schemas.microsoft.com/office/word/2020/wordml/sdtdatahash" xmlns:w16sdtfl="http://schemas.microsoft.com/office/word/2024/wordml/sdtformatlock" xmlns:w16se="http://schemas.microsoft.com/office/word/2015/wordml/symex" xmlns:wpg="http://schemas.microsoft.com/office/word/2010/wordprocessingGroup" xmlns:wpi="http://schemas.microsoft.com/office/word/2010/wordprocessingInk" xmlns:wne="http://schemas.microsoft.com/office/word/2006/wordml" xmlns:wps="http://schemas.microsoft.com/office/word/2010/wordprocessingShape" mc:Ignorable="w14 w15 w16se w16cid w16 w16cex w16sdtdh w16sdtfl w16du wp14">
+  <w:p>
+    <w:pPr>
+      <w:pStyle w:val="Footer"/>
+      <w:jc w:val="center"/>
+      <w:rPr>
+        <w:caps/>
+        <w:noProof/>
+        <w:color w:val="156082" w:themeColor="accent1"/>
+      </w:rPr>
+    </w:pPr>
+    <w:r>
+      <w:rPr>
+        <w:caps/>
+        <w:color w:val="156082" w:themeColor="accent1"/>
+      </w:rPr>
+      <w:fldChar w:fldCharType="begin"/>
+    </w:r>
+    <w:r>
+      <w:rPr>
+        <w:caps/>
+        <w:color w:val="156082" w:themeColor="accent1"/>
+      </w:rPr>
+      <w:instrText xml:space="preserve"> PAGE   \* MERGEFORMAT </w:instrText>
+    </w:r>
+    <w:r>
+      <w:rPr>
+        <w:caps/>
+        <w:color w:val="156082" w:themeColor="accent1"/>
+      </w:rPr>
+      <w:fldChar w:fldCharType="separate"/>
+    </w:r>
+    <w:r>
+      <w:rPr>
+        <w:caps/>
+        <w:noProof/>
+        <w:color w:val="156082" w:themeColor="accent1"/>
+      </w:rPr>
+      <w:t>2</w:t>
+    </w:r>
+    <w:r>
+      <w:rPr>
+        <w:caps/>
+        <w:noProof/>
+        <w:color w:val="156082" w:themeColor="accent1"/>
+      </w:rPr>
+      <w:fldChar w:fldCharType="end"/>
+    </w:r>
+  </w:p>
+  <w:p>
+    <w:pPr>
+      <w:pStyle w:val="Footer"/>
+    </w:pPr>
+  </w:p>
+</w:ftr>
+</file>
+
+<file path=word/footnotes.xml><?xml version="1.0" encoding="utf-8"?>
+<w:footnotes xmlns:wpc="http://schemas.microsoft.com/office/word/2010/wordprocessingCanvas" xmlns:cx="http://schemas.microsoft.com/office/drawing/2014/chartex" xmlns:cx1="http://schemas.microsoft.com/office/drawing/2015/9/8/chartex" xmlns:cx2="http://schemas.microsoft.com/office/drawing/2015/10/21/chartex" xmlns:cx3="http://schemas.microsoft.com/office/drawing/2016/5/9/chartex" xmlns:cx4="http://schemas.microsoft.com/office/drawing/2016/5/10/chartex" xmlns:cx5="http://schemas.microsoft.com/office/drawing/2016/5/11/chartex" xmlns:cx6="http://schemas.microsoft.com/office/drawing/2016/5/12/chartex" xmlns:cx7="http://schemas.microsoft.com/office/drawing/2016/5/13/chartex" xmlns:cx8="http://schemas.microsoft.com/office/drawing/2016/5/14/chartex" xmlns:mc="http://schemas.openxmlformats.org/markup-compatibility/2006" xmlns:aink="http://schemas.microsoft.com/office/drawing/2016/ink" xmlns:am3d="http://schemas.microsoft.com/office/drawing/2017/model3d" xmlns:o="urn:schemas-microsoft-com:office:office" xmlns:oel="http://schemas.microsoft.com/office/2019/extlst" xmlns:r="http://schemas.openxmlformats.org/officeDocument/2006/relationships" xmlns:m="http://schemas.openxmlformats.org/officeDocument/2006/math" xmlns:v="urn:schemas-microsoft-com:vml" xmlns:wp14="http://schemas.microsoft.com/office/word/2010/wordprocessingDrawing" xmlns:wp="http://schemas.openxmlformats.org/drawingml/2006/wordprocessingDrawing" xmlns:w10="urn:schemas-microsoft-com:office:word" xmlns:w="http://schemas.openxmlformats.org/wordprocessingml/2006/main" xmlns:w14="http://schemas.microsoft.com/office/word/2010/wordml" xmlns:w15="http://schemas.microsoft.com/office/word/2012/wordml" xmlns:w16cex="http://schemas.microsoft.com/office/word/2018/wordml/cex" xmlns:w16cid="http://schemas.microsoft.com/office/word/2016/wordml/cid" xmlns:w16="http://schemas.microsoft.com/office/word/2018/wordml" xmlns:w16du="http://schemas.microsoft.com/office/word/2023/wordml/word16du" xmlns:w16sdtdh="http://schemas.microsoft.com/office/word/2020/wordml/sdtdatahash" xmlns:w16sdtfl="http://schemas.microsoft.com/office/word/2024/wordml/sdtformatlock" xmlns:w16se="http://schemas.microsoft.com/office/word/2015/wordml/symex" xmlns:wpg="http://schemas.microsoft.com/office/word/2010/wordprocessingGroup" xmlns:wpi="http://schemas.microsoft.com/office/word/2010/wordprocessingInk" xmlns:wne="http://schemas.microsoft.com/office/word/2006/wordml" xmlns:wps="http://schemas.microsoft.com/office/word/2010/wordprocessingShape" mc:Ignorable="w14 w15 w16se w16cid w16 w16cex w16sdtdh w16sdtfl w16du wp14">
+  <w:footnote w:type="separator" w:id="-1">
+    <w:p>
+      <w:pPr>
+        <w:spacing w:after="0" w:line="240" w:lineRule="auto"/>
+      </w:pPr>
+      <w:r>
+        <w:separator/>
+      </w:r>
+    </w:p>
+  </w:footnote>
+  <w:footnote w:type="continuationSeparator" w:id="0">
+    <w:p>
+      <w:pPr>
+        <w:spacing w:after="0" w:line="240" w:lineRule="auto"/>
+      </w:pPr>
+      <w:r>
+        <w:continuationSeparator/>
+      </w:r>
+    </w:p>
+  </w:footnote>
+</w:footnotes>
+</file>
+
+<file path=word/header1.xml><?xml version="1.0" encoding="utf-8"?>
+<w:hdr xmlns:wpc="http://schemas.microsoft.com/office/word/2010/wordprocessingCanvas" xmlns:cx="http://schemas.microsoft.com/office/drawing/2014/chartex" xmlns:cx1="http://schemas.microsoft.com/office/drawing/2015/9/8/chartex" xmlns:cx2="http://schemas.microsoft.com/office/drawing/2015/10/21/chartex" xmlns:cx3="http://schemas.microsoft.com/office/drawing/2016/5/9/chartex" xmlns:cx4="http://schemas.microsoft.com/office/drawing/2016/5/10/chartex" xmlns:cx5="http://schemas.microsoft.com/office/drawing/2016/5/11/chartex" xmlns:cx6="http://schemas.microsoft.com/office/drawing/2016/5/12/chartex" xmlns:cx7="http://schemas.microsoft.com/office/drawing/2016/5/13/chartex" xmlns:cx8="http://schemas.microsoft.com/office/drawing/2016/5/14/chartex" xmlns:mc="http://schemas.openxmlformats.org/markup-compatibility/2006" xmlns:aink="http://schemas.microsoft.com/office/drawing/2016/ink" xmlns:am3d="http://schemas.microsoft.com/office/drawing/2017/model3d" xmlns:o="urn:schemas-microsoft-com:office:office" xmlns:oel="http://schemas.microsoft.com/office/2019/extlst" xmlns:r="http://schemas.openxmlformats.org/officeDocument/2006/relationships" xmlns:m="http://schemas.openxmlformats.org/officeDocument/2006/math" xmlns:v="urn:schemas-microsoft-com:vml" xmlns:wp14="http://schemas.microsoft.com/office/word/2010/wordprocessingDrawing" xmlns:wp="http://schemas.openxmlformats.org/drawingml/2006/wordprocessingDrawing" xmlns:w10="urn:schemas-microsoft-com:office:word" xmlns:w="http://schemas.openxmlformats.org/wordprocessingml/2006/main" xmlns:w14="http://schemas.microsoft.com/office/word/2010/wordml" xmlns:w15="http://schemas.microsoft.com/office/word/2012/wordml" xmlns:w16cex="http://schemas.microsoft.com/office/word/2018/wordml/cex" xmlns:w16cid="http://schemas.microsoft.com/office/word/2016/wordml/cid" xmlns:w16="http://schemas.microsoft.com/office/word/2018/wordml" xmlns:w16du="http://schemas.microsoft.com/office/word/2023/wordml/word16du" xmlns:w16sdtdh="http://schemas.microsoft.com/office/word/2020/wordml/sdtdatahash" xmlns:w16sdtfl="http://schemas.microsoft.com/office/word/2024/wordml/sdtformatlock" xmlns:w16se="http://schemas.microsoft.com/office/word/2015/wordml/symex" xmlns:wpg="http://schemas.microsoft.com/office/word/2010/wordprocessingGroup" xmlns:wpi="http://schemas.microsoft.com/office/word/2010/wordprocessingInk" xmlns:wne="http://schemas.microsoft.com/office/word/2006/wordml" xmlns:wps="http://schemas.microsoft.com/office/word/2010/wordprocessingShape" mc:Ignorable="w14 w15 w16se w16cid w16 w16cex w16sdtdh w16sdtfl w16du wp14">
+  <w:p>
+    <w:pPr>
+      <w:pStyle w:val="Header"/>
+    </w:pPr>
+    <w:r>
+      <w:t xml:space="preserve">BBDD </w:t>
+    </w:r>
+    <w:r>
+      <w:t xml:space="preserve">Proyecto </w:t>
+    </w:r>
+    <w:proofErr w:type="spellStart"/>
+    <w:r>
+      <w:t>Intermodular</w:t>
+    </w:r>
+    <w:proofErr w:type="spellEnd"/>
+  </w:p>
+</w:hdr>
 </file>
 
 <file path=word/numbering.xml><?xml version="1.0" encoding="utf-8"?>
@@ -7185,6 +8637,83 @@
       <w:spacing w:val="5"/>
     </w:rPr>
   </w:style>
+  <w:style w:type="paragraph" w:styleId="NoSpacing">
+    <w:name w:val="No Spacing"/>
+    <w:link w:val="NoSpacingChar"/>
+    <w:uiPriority w:val="1"/>
+    <w:qFormat/>
+    <w:rsid w:val="00D05EC7"/>
+    <w:pPr>
+      <w:spacing w:after="0" w:line="240" w:lineRule="auto"/>
+    </w:pPr>
+    <w:rPr>
+      <w:rFonts w:eastAsiaTheme="minorEastAsia"/>
+      <w:kern w:val="0"/>
+      <w:sz w:val="22"/>
+      <w:szCs w:val="22"/>
+      <w:lang w:val="en-US"/>
+      <w14:ligatures w14:val="none"/>
+    </w:rPr>
+  </w:style>
+  <w:style w:type="character" w:customStyle="1" w:styleId="NoSpacingChar">
+    <w:name w:val="No Spacing Char"/>
+    <w:basedOn w:val="DefaultParagraphFont"/>
+    <w:link w:val="NoSpacing"/>
+    <w:uiPriority w:val="1"/>
+    <w:rsid w:val="00D05EC7"/>
+    <w:rPr>
+      <w:rFonts w:eastAsiaTheme="minorEastAsia"/>
+      <w:kern w:val="0"/>
+      <w:sz w:val="22"/>
+      <w:szCs w:val="22"/>
+      <w:lang w:val="en-US"/>
+      <w14:ligatures w14:val="none"/>
+    </w:rPr>
+  </w:style>
+  <w:style w:type="paragraph" w:styleId="Header">
+    <w:name w:val="header"/>
+    <w:basedOn w:val="Normal"/>
+    <w:link w:val="HeaderChar"/>
+    <w:uiPriority w:val="99"/>
+    <w:unhideWhenUsed/>
+    <w:rsid w:val="00510DD0"/>
+    <w:pPr>
+      <w:tabs>
+        <w:tab w:val="center" w:pos="4252"/>
+        <w:tab w:val="right" w:pos="8504"/>
+      </w:tabs>
+      <w:spacing w:after="0" w:line="240" w:lineRule="auto"/>
+    </w:pPr>
+  </w:style>
+  <w:style w:type="character" w:customStyle="1" w:styleId="HeaderChar">
+    <w:name w:val="Header Char"/>
+    <w:basedOn w:val="DefaultParagraphFont"/>
+    <w:link w:val="Header"/>
+    <w:uiPriority w:val="99"/>
+    <w:rsid w:val="00510DD0"/>
+  </w:style>
+  <w:style w:type="paragraph" w:styleId="Footer">
+    <w:name w:val="footer"/>
+    <w:basedOn w:val="Normal"/>
+    <w:link w:val="FooterChar"/>
+    <w:uiPriority w:val="99"/>
+    <w:unhideWhenUsed/>
+    <w:rsid w:val="00510DD0"/>
+    <w:pPr>
+      <w:tabs>
+        <w:tab w:val="center" w:pos="4252"/>
+        <w:tab w:val="right" w:pos="8504"/>
+      </w:tabs>
+      <w:spacing w:after="0" w:line="240" w:lineRule="auto"/>
+    </w:pPr>
+  </w:style>
+  <w:style w:type="character" w:customStyle="1" w:styleId="FooterChar">
+    <w:name w:val="Footer Char"/>
+    <w:basedOn w:val="DefaultParagraphFont"/>
+    <w:link w:val="Footer"/>
+    <w:uiPriority w:val="99"/>
+    <w:rsid w:val="00510DD0"/>
+  </w:style>
 </w:styles>
 </file>
 
@@ -7504,9 +9033,14 @@
 </file>
 
 <file path=customXml/item1.xml><?xml version="1.0" encoding="utf-8"?>
-<p:properties xmlns:p="http://schemas.microsoft.com/office/2006/metadata/properties" xmlns:xsi="http://www.w3.org/2001/XMLSchema-instance" xmlns:pc="http://schemas.microsoft.com/office/infopath/2007/PartnerControls">
-  <documentManagement/>
-</p:properties>
+<CoverPageProperties xmlns="http://schemas.microsoft.com/office/2006/coverPageProps">
+  <PublishDate>1DAM</PublishDate>
+  <Abstract/>
+  <CompanyAddress/>
+  <CompanyPhone/>
+  <CompanyFax/>
+  <CompanyEmail/>
+</CoverPageProperties>
 </file>
 
 <file path=customXml/item2.xml><?xml version="1.0" encoding="utf-8"?>
@@ -7519,6 +9053,12 @@
 </file>
 
 <file path=customXml/item3.xml><?xml version="1.0" encoding="utf-8"?>
+<p:properties xmlns:p="http://schemas.microsoft.com/office/2006/metadata/properties" xmlns:xsi="http://www.w3.org/2001/XMLSchema-instance" xmlns:pc="http://schemas.microsoft.com/office/infopath/2007/PartnerControls">
+  <documentManagement/>
+</p:properties>
+</file>
+
+<file path=customXml/item4.xml><?xml version="1.0" encoding="utf-8"?>
 <ct:contentTypeSchema xmlns:ct="http://schemas.microsoft.com/office/2006/metadata/contentType" xmlns:ma="http://schemas.microsoft.com/office/2006/metadata/properties/metaAttributes" ct:_="" ma:_="" ma:contentTypeName="Document" ma:contentTypeID="0x010100BF172252CC1C53449338812EA1037233" ma:contentTypeVersion="4" ma:contentTypeDescription="Create a new document." ma:contentTypeScope="" ma:versionID="19cf7ed37a14517615dffa0af7ae0657">
   <xsd:schema xmlns:xsd="http://www.w3.org/2001/XMLSchema" xmlns:xs="http://www.w3.org/2001/XMLSchema" xmlns:p="http://schemas.microsoft.com/office/2006/metadata/properties" xmlns:ns3="c4716d38-bf25-4bcd-9478-3a7eb44f1881" targetNamespace="http://schemas.microsoft.com/office/2006/metadata/properties" ma:root="true" ma:fieldsID="3cf0a78e66cb48c586d9b2154a08e24c" ns3:_="">
     <xsd:import namespace="c4716d38-bf25-4bcd-9478-3a7eb44f1881"/>
@@ -7662,11 +9202,14 @@
 </ct:contentTypeSchema>
 </file>
 
+<file path=customXml/item5.xml><?xml version="1.0" encoding="utf-8"?>
+<b:Sources xmlns:b="http://schemas.openxmlformats.org/officeDocument/2006/bibliography" xmlns="http://schemas.openxmlformats.org/officeDocument/2006/bibliography" SelectedStyle="\APASixthEditionOfficeOnline.xsl" StyleName="APA" Version="6"/>
+</file>
+
 <file path=customXml/itemProps1.xml><?xml version="1.0" encoding="utf-8"?>
-<ds:datastoreItem xmlns:ds="http://schemas.openxmlformats.org/officeDocument/2006/customXml" ds:itemID="{935CD2EF-4A2D-48F5-BFC3-D151D89F2011}">
+<ds:datastoreItem xmlns:ds="http://schemas.openxmlformats.org/officeDocument/2006/customXml" ds:itemID="{55AF091B-3C7A-41E3-B477-F2FDAA23CFDA}">
   <ds:schemaRefs>
-    <ds:schemaRef ds:uri="http://schemas.microsoft.com/office/2006/metadata/properties"/>
-    <ds:schemaRef ds:uri="http://schemas.microsoft.com/office/infopath/2007/PartnerControls"/>
+    <ds:schemaRef ds:uri="http://schemas.microsoft.com/office/2006/coverPageProps"/>
   </ds:schemaRefs>
 </ds:datastoreItem>
 </file>
@@ -7680,6 +9223,15 @@
 </file>
 
 <file path=customXml/itemProps3.xml><?xml version="1.0" encoding="utf-8"?>
+<ds:datastoreItem xmlns:ds="http://schemas.openxmlformats.org/officeDocument/2006/customXml" ds:itemID="{935CD2EF-4A2D-48F5-BFC3-D151D89F2011}">
+  <ds:schemaRefs>
+    <ds:schemaRef ds:uri="http://schemas.microsoft.com/office/2006/metadata/properties"/>
+    <ds:schemaRef ds:uri="http://schemas.microsoft.com/office/infopath/2007/PartnerControls"/>
+  </ds:schemaRefs>
+</ds:datastoreItem>
+</file>
+
+<file path=customXml/itemProps4.xml><?xml version="1.0" encoding="utf-8"?>
 <ds:datastoreItem xmlns:ds="http://schemas.openxmlformats.org/officeDocument/2006/customXml" ds:itemID="{D1D5086A-592E-46A4-B551-F7D069735410}">
   <ds:schemaRefs>
     <ds:schemaRef ds:uri="http://schemas.microsoft.com/office/2006/metadata/contentType"/>
@@ -7695,4 +9247,12 @@
     <ds:schemaRef ds:uri="http://schemas.microsoft.com/internal/obd"/>
   </ds:schemaRefs>
 </ds:datastoreItem>
+</file>
+
+<file path=customXml/itemProps5.xml><?xml version="1.0" encoding="utf-8"?>
+<ds:datastoreItem xmlns:ds="http://schemas.openxmlformats.org/officeDocument/2006/customXml" ds:itemID="{9D7EF669-8066-489D-8320-126E791F4245}">
+  <ds:schemaRefs>
+    <ds:schemaRef ds:uri="http://schemas.openxmlformats.org/officeDocument/2006/bibliography"/>
+  </ds:schemaRefs>
+</ds:datastoreItem>
 </file>
</xml_diff>